<commit_message>
removed Testing files and moved raw data to ignored bin folder
</commit_message>
<xml_diff>
--- a/data/Data Documentation.docx
+++ b/data/Data Documentation.docx
@@ -28,8 +28,18 @@
         <w:pStyle w:val="Heading2"/>
       </w:pPr>
       <w:r>
-        <w:t xml:space="preserve">Statistical Area 2 </w:t>
+        <w:t>2023</w:t>
       </w:r>
+      <w:r>
+        <w:t xml:space="preserve"> Census totals by topic for individuals by statistical area 2 – part 2</w:t>
+      </w:r>
+    </w:p>
+    <w:p>
+      <w:pPr>
+        <w:rPr>
+          <w:lang w:val="en-US" w:eastAsia="ja-JP"/>
+        </w:rPr>
+      </w:pPr>
     </w:p>
     <w:tbl>
       <w:tblPr>
@@ -39,13 +49,13 @@
         <w:tblLook w:val="04A0" w:firstRow="1" w:lastRow="0" w:firstColumn="1" w:lastColumn="0" w:noHBand="0" w:noVBand="1"/>
       </w:tblPr>
       <w:tblGrid>
-        <w:gridCol w:w="2171"/>
-        <w:gridCol w:w="6459"/>
+        <w:gridCol w:w="2144"/>
+        <w:gridCol w:w="6486"/>
       </w:tblGrid>
       <w:tr>
         <w:tc>
           <w:tcPr>
-            <w:tcW w:w="2245" w:type="dxa"/>
+            <w:tcW w:w="2144" w:type="dxa"/>
             <w:shd w:val="clear" w:color="auto" w:fill="C1E4F5" w:themeFill="accent1" w:themeFillTint="33"/>
           </w:tcPr>
           <w:p>
@@ -56,19 +66,64 @@
         </w:tc>
         <w:tc>
           <w:tcPr>
-            <w:tcW w:w="6663" w:type="dxa"/>
+            <w:tcW w:w="6486" w:type="dxa"/>
           </w:tcPr>
           <w:p>
-            <w:r>
-              <w:t>Land, Air, Water Aotearoa (LAWA) – Download Data https://www.lawa.org.nz/download-data</w:t>
-            </w:r>
+            <w:pPr>
+              <w:rPr>
+                <w:lang w:val="en-US"/>
+              </w:rPr>
+            </w:pPr>
+            <w:r>
+              <w:rPr>
+                <w:lang w:val="en-US"/>
+              </w:rPr>
+              <w:t xml:space="preserve">STATSNZ </w:t>
+            </w:r>
+          </w:p>
+          <w:p>
+            <w:pPr>
+              <w:rPr>
+                <w:lang w:val="en-US"/>
+              </w:rPr>
+            </w:pPr>
+          </w:p>
+          <w:p>
+            <w:pPr>
+              <w:rPr>
+                <w:lang w:val="en-US"/>
+              </w:rPr>
+            </w:pPr>
+            <w:r>
+              <w:rPr>
+                <w:lang w:val="en-US"/>
+              </w:rPr>
+              <w:t>2023 Census totals by topic for individuals by statistical area 2 – part 2</w:t>
+            </w:r>
+          </w:p>
+          <w:p>
+            <w:pPr>
+              <w:rPr>
+                <w:lang w:val="en-US"/>
+              </w:rPr>
+            </w:pPr>
+          </w:p>
+          <w:p>
+            <w:hyperlink r:id="rId5" w:history="1">
+              <w:r>
+                <w:rPr>
+                  <w:rStyle w:val="Hyperlink"/>
+                </w:rPr>
+                <w:t>https://datafinder.stats.govt.nz/layer/120898-2023-census-totals-by-topic-for-individuals-by-statistical-area-2-part-2/attachments/25549/</w:t>
+              </w:r>
+            </w:hyperlink>
           </w:p>
         </w:tc>
       </w:tr>
       <w:tr>
         <w:tc>
           <w:tcPr>
-            <w:tcW w:w="2245" w:type="dxa"/>
+            <w:tcW w:w="2144" w:type="dxa"/>
             <w:shd w:val="clear" w:color="auto" w:fill="C1E4F5" w:themeFill="accent1" w:themeFillTint="33"/>
           </w:tcPr>
           <w:p>
@@ -79,11 +134,25 @@
         </w:tc>
         <w:tc>
           <w:tcPr>
-            <w:tcW w:w="6663" w:type="dxa"/>
+            <w:tcW w:w="6486" w:type="dxa"/>
           </w:tcPr>
-          <w:p>
-            <w:r>
-              <w:t>LAWA aggregates air quality data from regional councils across Aotearoa New Zealand. In Auckland, the data is collected by Auckland Council’s Environmental Monitoring Team as part of their statutory responsibilities under the Resource Management Act 1991 and the National Environmental Standards for Air Quality (NESAQ).</w:t>
+          <w:p/>
+          <w:p/>
+        </w:tc>
+      </w:tr>
+      <w:tr>
+        <w:trPr>
+          <w:gridAfter w:val="1"/>
+          <w:wAfter w:w="6486" w:type="dxa"/>
+        </w:trPr>
+        <w:tc>
+          <w:tcPr>
+            <w:tcW w:w="2144" w:type="dxa"/>
+            <w:shd w:val="clear" w:color="auto" w:fill="C1E4F5" w:themeFill="accent1" w:themeFillTint="33"/>
+          </w:tcPr>
+          <w:p>
+            <w:r>
+              <w:t>How it is collected</w:t>
             </w:r>
           </w:p>
         </w:tc>
@@ -91,56 +160,167 @@
       <w:tr>
         <w:tc>
           <w:tcPr>
-            <w:tcW w:w="2245" w:type="dxa"/>
+            <w:tcW w:w="2144" w:type="dxa"/>
             <w:shd w:val="clear" w:color="auto" w:fill="C1E4F5" w:themeFill="accent1" w:themeFillTint="33"/>
           </w:tcPr>
           <w:p>
             <w:r>
-              <w:t>How it is collected</w:t>
+              <w:t>Purpose of collection</w:t>
             </w:r>
           </w:p>
         </w:tc>
         <w:tc>
           <w:tcPr>
-            <w:tcW w:w="6663" w:type="dxa"/>
+            <w:tcW w:w="6486" w:type="dxa"/>
           </w:tcPr>
-          <w:p>
-            <w:r>
-              <w:t xml:space="preserve">Air quality is measured using fixed monitoring stations equipped with continuous particulate monitors (e.g., Beta Attenuation Monitors, optical particle counters). These instruments record hourly or daily concentrations of particulate </w:t>
-            </w:r>
-            <w:r>
-              <w:t xml:space="preserve">matter. </w:t>
-            </w:r>
-          </w:p>
+          <w:p/>
         </w:tc>
       </w:tr>
       <w:tr>
         <w:tc>
           <w:tcPr>
-            <w:tcW w:w="2245" w:type="dxa"/>
+            <w:tcW w:w="2144" w:type="dxa"/>
             <w:shd w:val="clear" w:color="auto" w:fill="C1E4F5" w:themeFill="accent1" w:themeFillTint="33"/>
           </w:tcPr>
           <w:p>
             <w:r>
-              <w:t>Purpose of collection</w:t>
-            </w:r>
-          </w:p>
+              <w:t xml:space="preserve">Structure </w:t>
+            </w:r>
+          </w:p>
+          <w:p/>
         </w:tc>
         <w:tc>
           <w:tcPr>
-            <w:tcW w:w="6663" w:type="dxa"/>
+            <w:tcW w:w="6486" w:type="dxa"/>
           </w:tcPr>
-          <w:p>
-            <w:r>
-              <w:t>The data is used to assess compliance with national air quality standards, monitor long</w:t>
-            </w:r>
-            <w:r>
-              <w:noBreakHyphen/>
-              <w:t>term trends, inform environmental policy, and evaluate the effectiveness of emission</w:t>
-            </w:r>
-            <w:r>
-              <w:noBreakHyphen/>
-              <w:t>reduction strategies</w:t>
+          <w:p/>
+        </w:tc>
+      </w:tr>
+    </w:tbl>
+    <w:p>
+      <w:pPr>
+        <w:rPr>
+          <w:rFonts w:ascii="Aharoni" w:eastAsiaTheme="majorEastAsia" w:hAnsi="Aharoni" w:cstheme="majorBidi"/>
+          <w:b/>
+          <w:bCs/>
+          <w:color w:val="00B0F0"/>
+          <w:sz w:val="32"/>
+          <w:szCs w:val="32"/>
+          <w:lang w:val="en-US" w:eastAsia="ja-JP"/>
+        </w:rPr>
+      </w:pPr>
+    </w:p>
+    <w:p>
+      <w:pPr>
+        <w:rPr>
+          <w:rFonts w:ascii="Aharoni" w:eastAsiaTheme="majorEastAsia" w:hAnsi="Aharoni" w:cstheme="majorBidi"/>
+          <w:b/>
+          <w:bCs/>
+          <w:color w:val="00B0F0"/>
+          <w:sz w:val="32"/>
+          <w:szCs w:val="32"/>
+          <w:lang w:val="en-US" w:eastAsia="ja-JP"/>
+        </w:rPr>
+      </w:pPr>
+    </w:p>
+    <w:p>
+      <w:pPr>
+        <w:rPr>
+          <w:rFonts w:ascii="Aharoni" w:eastAsiaTheme="majorEastAsia" w:hAnsi="Aharoni" w:cstheme="majorBidi"/>
+          <w:b/>
+          <w:bCs/>
+          <w:color w:val="00B0F0"/>
+          <w:sz w:val="32"/>
+          <w:szCs w:val="32"/>
+          <w:lang w:val="en-US" w:eastAsia="ja-JP"/>
+        </w:rPr>
+      </w:pPr>
+    </w:p>
+    <w:p>
+      <w:pPr>
+        <w:pStyle w:val="Heading2"/>
+      </w:pPr>
+      <w:r>
+        <w:t>New Zealand Deprivation Index 2023</w:t>
+      </w:r>
+    </w:p>
+    <w:p>
+      <w:pPr>
+        <w:rPr>
+          <w:lang w:val="en-US" w:eastAsia="ja-JP"/>
+        </w:rPr>
+      </w:pPr>
+    </w:p>
+    <w:tbl>
+      <w:tblPr>
+        <w:tblStyle w:val="TableGrid"/>
+        <w:tblW w:w="0" w:type="auto"/>
+        <w:tblInd w:w="720" w:type="dxa"/>
+        <w:tblLook w:val="04A0" w:firstRow="1" w:lastRow="0" w:firstColumn="1" w:lastColumn="0" w:noHBand="0" w:noVBand="1"/>
+      </w:tblPr>
+      <w:tblGrid>
+        <w:gridCol w:w="1899"/>
+        <w:gridCol w:w="6731"/>
+      </w:tblGrid>
+      <w:tr>
+        <w:tc>
+          <w:tcPr>
+            <w:tcW w:w="2144" w:type="dxa"/>
+            <w:shd w:val="clear" w:color="auto" w:fill="C1E4F5" w:themeFill="accent1" w:themeFillTint="33"/>
+          </w:tcPr>
+          <w:p>
+            <w:r>
+              <w:t>Source</w:t>
+            </w:r>
+          </w:p>
+        </w:tc>
+        <w:tc>
+          <w:tcPr>
+            <w:tcW w:w="6486" w:type="dxa"/>
+          </w:tcPr>
+          <w:p>
+            <w:pPr>
+              <w:rPr>
+                <w:lang w:val="en-US"/>
+              </w:rPr>
+            </w:pPr>
+            <w:r>
+              <w:rPr>
+                <w:lang w:val="en-US"/>
+              </w:rPr>
+              <w:t xml:space="preserve">STATSNZ </w:t>
+            </w:r>
+          </w:p>
+          <w:p>
+            <w:pPr>
+              <w:rPr>
+                <w:lang w:val="en-US"/>
+              </w:rPr>
+            </w:pPr>
+          </w:p>
+          <w:p>
+            <w:pPr>
+              <w:rPr>
+                <w:lang w:val="en-US"/>
+              </w:rPr>
+            </w:pPr>
+            <w:r>
+              <w:rPr>
+                <w:lang w:val="en-US"/>
+              </w:rPr>
+              <w:t>2023 Census totals by topic for individuals by statistical area 2 – part 2</w:t>
+            </w:r>
+          </w:p>
+          <w:p>
+            <w:pPr>
+              <w:rPr>
+                <w:lang w:val="en-US"/>
+              </w:rPr>
+            </w:pPr>
+          </w:p>
+          <w:p>
+            <w:r>
+              <w:t>https://www.otago.ac.nz/wellington/research/groups/research-groups-in-the-department-of-public-health/hirp/socioeconomic-deprivation-indexes</w:t>
             </w:r>
           </w:p>
         </w:tc>
@@ -148,7 +328,384 @@
       <w:tr>
         <w:tc>
           <w:tcPr>
-            <w:tcW w:w="2245" w:type="dxa"/>
+            <w:tcW w:w="2144" w:type="dxa"/>
+            <w:shd w:val="clear" w:color="auto" w:fill="C1E4F5" w:themeFill="accent1" w:themeFillTint="33"/>
+          </w:tcPr>
+          <w:p>
+            <w:r>
+              <w:t>Who collects it</w:t>
+            </w:r>
+          </w:p>
+        </w:tc>
+        <w:tc>
+          <w:tcPr>
+            <w:tcW w:w="6486" w:type="dxa"/>
+          </w:tcPr>
+          <w:p/>
+          <w:p>
+            <w:r>
+              <w:rPr>
+                <w:b/>
+                <w:bCs/>
+                <w:lang w:val="en-US"/>
+              </w:rPr>
+              <w:lastRenderedPageBreak/>
+              <w:t>Stats NZ</w:t>
+            </w:r>
+            <w:r>
+              <w:rPr>
+                <w:lang w:val="en-US"/>
+              </w:rPr>
+              <w:t xml:space="preserve"> collects the raw </w:t>
+            </w:r>
+            <w:proofErr w:type="spellStart"/>
+            <w:proofErr w:type="gramStart"/>
+            <w:r>
+              <w:rPr>
+                <w:lang w:val="en-US"/>
+              </w:rPr>
+              <w:t>data</w:t>
+            </w:r>
+            <w:r>
+              <w:rPr>
+                <w:lang w:val="en-US"/>
+              </w:rPr>
+              <w:t>.I</w:t>
+            </w:r>
+            <w:r>
+              <w:rPr>
+                <w:lang w:val="en-US"/>
+              </w:rPr>
+              <w:t>t</w:t>
+            </w:r>
+            <w:proofErr w:type="spellEnd"/>
+            <w:proofErr w:type="gramEnd"/>
+            <w:r>
+              <w:rPr>
+                <w:lang w:val="en-US"/>
+              </w:rPr>
+              <w:t xml:space="preserve"> runs the five-yearly Census of Population and Dwellings, the source of every variable </w:t>
+            </w:r>
+            <w:proofErr w:type="spellStart"/>
+            <w:r>
+              <w:rPr>
+                <w:lang w:val="en-US"/>
+              </w:rPr>
+              <w:t>NZDep</w:t>
+            </w:r>
+            <w:proofErr w:type="spellEnd"/>
+            <w:r>
+              <w:rPr>
+                <w:lang w:val="en-US"/>
+              </w:rPr>
+              <w:t xml:space="preserve"> use</w:t>
+            </w:r>
+            <w:r>
+              <w:rPr>
+                <w:lang w:val="en-US"/>
+              </w:rPr>
+              <w:t>s.</w:t>
+            </w:r>
+            <w:r>
+              <w:t xml:space="preserve"> </w:t>
+            </w:r>
+          </w:p>
+          <w:p>
+            <w:pPr>
+              <w:rPr>
+                <w:lang w:val="en-US"/>
+              </w:rPr>
+            </w:pPr>
+          </w:p>
+          <w:p>
+            <w:pPr>
+              <w:rPr>
+                <w:lang w:val="en-US"/>
+              </w:rPr>
+            </w:pPr>
+            <w:r>
+              <w:rPr>
+                <w:b/>
+                <w:bCs/>
+                <w:lang w:val="en-US"/>
+              </w:rPr>
+              <w:t>The University of Otago's Department of Public Health (Wellington)</w:t>
+            </w:r>
+            <w:r>
+              <w:rPr>
+                <w:lang w:val="en-US"/>
+              </w:rPr>
+              <w:t xml:space="preserve"> constructs the index itself.</w:t>
+            </w:r>
+          </w:p>
+          <w:p>
+            <w:pPr>
+              <w:rPr>
+                <w:lang w:val="en-US"/>
+              </w:rPr>
+            </w:pPr>
+          </w:p>
+        </w:tc>
+      </w:tr>
+      <w:tr>
+        <w:trPr>
+          <w:gridAfter w:val="1"/>
+          <w:wAfter w:w="6486" w:type="dxa"/>
+        </w:trPr>
+        <w:tc>
+          <w:tcPr>
+            <w:tcW w:w="2144" w:type="dxa"/>
+            <w:shd w:val="clear" w:color="auto" w:fill="C1E4F5" w:themeFill="accent1" w:themeFillTint="33"/>
+          </w:tcPr>
+          <w:p>
+            <w:r>
+              <w:lastRenderedPageBreak/>
+              <w:t>How it is collected</w:t>
+            </w:r>
+          </w:p>
+        </w:tc>
+      </w:tr>
+      <w:tr>
+        <w:tc>
+          <w:tcPr>
+            <w:tcW w:w="2144" w:type="dxa"/>
+            <w:shd w:val="clear" w:color="auto" w:fill="C1E4F5" w:themeFill="accent1" w:themeFillTint="33"/>
+          </w:tcPr>
+          <w:p>
+            <w:r>
+              <w:t>How it is collected</w:t>
+            </w:r>
+          </w:p>
+          <w:p/>
+          <w:p/>
+          <w:p/>
+          <w:p/>
+          <w:p/>
+          <w:p/>
+          <w:p/>
+          <w:p/>
+          <w:p/>
+          <w:p/>
+          <w:p/>
+          <w:p/>
+          <w:p/>
+          <w:p>
+            <w:r>
+              <w:t>Purpose of collection</w:t>
+            </w:r>
+          </w:p>
+        </w:tc>
+        <w:tc>
+          <w:tcPr>
+            <w:tcW w:w="6486" w:type="dxa"/>
+          </w:tcPr>
+          <w:p>
+            <w:pPr>
+              <w:pStyle w:val="ListParagraph"/>
+              <w:numPr>
+                <w:ilvl w:val="0"/>
+                <w:numId w:val="1"/>
+              </w:numPr>
+            </w:pPr>
+            <w:r>
+              <w:t xml:space="preserve"> For each small area, Otago researchers calculate the proportion of residents lacking each of nine specified attributes (e.g. proportion with no internet access, proportion unemployed).</w:t>
+            </w:r>
+          </w:p>
+          <w:p>
+            <w:pPr>
+              <w:pStyle w:val="ListParagraph"/>
+              <w:numPr>
+                <w:ilvl w:val="0"/>
+                <w:numId w:val="1"/>
+              </w:numPr>
+            </w:pPr>
+            <w:r>
+              <w:t xml:space="preserve"> </w:t>
+            </w:r>
+            <w:r>
+              <w:t xml:space="preserve">These proportions are </w:t>
+            </w:r>
+            <w:proofErr w:type="spellStart"/>
+            <w:r>
+              <w:t>standardised</w:t>
+            </w:r>
+            <w:proofErr w:type="spellEnd"/>
+            <w:r>
+              <w:t xml:space="preserve"> and combined using </w:t>
+            </w:r>
+            <w:r>
+              <w:rPr>
+                <w:b/>
+                <w:bCs/>
+              </w:rPr>
+              <w:t>Principal Components Analysis (PCA)</w:t>
+            </w:r>
+            <w:r>
+              <w:t xml:space="preserve"> — specifically, the index is the </w:t>
+            </w:r>
+            <w:r>
+              <w:rPr>
+                <w:i/>
+                <w:iCs/>
+              </w:rPr>
+              <w:t>first principal component</w:t>
+            </w:r>
+            <w:r>
+              <w:t xml:space="preserve"> of the </w:t>
+            </w:r>
+            <w:proofErr w:type="spellStart"/>
+            <w:r>
+              <w:t>standardised</w:t>
+            </w:r>
+            <w:proofErr w:type="spellEnd"/>
+            <w:r>
+              <w:t xml:space="preserve"> variables, i.e. the single weighted sum that explains the greatest share of overall variance across areas (60–65% typically) (</w:t>
+            </w:r>
+            <w:proofErr w:type="spellStart"/>
+            <w:r>
+              <w:t>Kotuitui</w:t>
+            </w:r>
+            <w:proofErr w:type="spellEnd"/>
+            <w:r>
+              <w:t>; NZDep91 original methodology paper).</w:t>
+            </w:r>
+          </w:p>
+          <w:p>
+            <w:pPr>
+              <w:rPr>
+                <w:lang w:val="en-US"/>
+              </w:rPr>
+            </w:pPr>
+          </w:p>
+          <w:p>
+            <w:pPr>
+              <w:rPr>
+                <w:lang w:val="en-US"/>
+              </w:rPr>
+            </w:pPr>
+          </w:p>
+          <w:p>
+            <w:pPr>
+              <w:rPr>
+                <w:lang w:val="en-US"/>
+              </w:rPr>
+            </w:pPr>
+          </w:p>
+          <w:p>
+            <w:pPr>
+              <w:rPr>
+                <w:lang w:val="en-US"/>
+              </w:rPr>
+            </w:pPr>
+          </w:p>
+          <w:p>
+            <w:pPr>
+              <w:rPr>
+                <w:lang w:val="en-US"/>
+              </w:rPr>
+            </w:pPr>
+          </w:p>
+          <w:p>
+            <w:pPr>
+              <w:rPr>
+                <w:lang w:val="en-US"/>
+              </w:rPr>
+            </w:pPr>
+            <w:r>
+              <w:rPr>
+                <w:lang w:val="en-US"/>
+              </w:rPr>
+              <w:t xml:space="preserve">NZDep1991 was explicitly designed with three purposes in mind: </w:t>
+            </w:r>
+            <w:r>
+              <w:rPr>
+                <w:b/>
+                <w:bCs/>
+                <w:lang w:val="en-US"/>
+              </w:rPr>
+              <w:t>resource allocation</w:t>
+            </w:r>
+            <w:r>
+              <w:rPr>
+                <w:lang w:val="en-US"/>
+              </w:rPr>
+              <w:t xml:space="preserve"> (e.g. targeting health/education funding), </w:t>
+            </w:r>
+            <w:r>
+              <w:rPr>
+                <w:b/>
+                <w:bCs/>
+                <w:lang w:val="en-US"/>
+              </w:rPr>
+              <w:t>research</w:t>
+            </w:r>
+            <w:r>
+              <w:rPr>
+                <w:lang w:val="en-US"/>
+              </w:rPr>
+              <w:t xml:space="preserve"> (a covariate for socioeconomic status in area-based studies), and </w:t>
+            </w:r>
+            <w:r>
+              <w:rPr>
+                <w:b/>
+                <w:bCs/>
+                <w:lang w:val="en-US"/>
+              </w:rPr>
+              <w:t>advocacy</w:t>
+            </w:r>
+            <w:r>
+              <w:rPr>
+                <w:lang w:val="en-US"/>
+              </w:rPr>
+              <w:t xml:space="preserve"> (highlighting geographic patterns of disadvantage). This is directly useful for your proposal's rationale — you can justify including </w:t>
+            </w:r>
+            <w:proofErr w:type="spellStart"/>
+            <w:r>
+              <w:rPr>
+                <w:lang w:val="en-US"/>
+              </w:rPr>
+              <w:t>NZDep</w:t>
+            </w:r>
+            <w:proofErr w:type="spellEnd"/>
+            <w:r>
+              <w:rPr>
+                <w:lang w:val="en-US"/>
+              </w:rPr>
+              <w:t xml:space="preserve"> as a control/predictor in your GWR because it was purpose-built for exactly this kind of secondary, area-based research </w:t>
+            </w:r>
+            <w:proofErr w:type="spellStart"/>
+            <w:r>
+              <w:rPr>
+                <w:lang w:val="en-US"/>
+              </w:rPr>
+              <w:t>use.</w:t>
+            </w:r>
+            <w:hyperlink r:id="rId6" w:tgtFrame="_blank" w:history="1">
+              <w:proofErr w:type="gramStart"/>
+              <w:r>
+                <w:rPr>
+                  <w:rStyle w:val="Hyperlink"/>
+                  <w:lang w:val="en-US"/>
+                </w:rPr>
+                <w:t>msd.govt</w:t>
+              </w:r>
+              <w:proofErr w:type="spellEnd"/>
+              <w:proofErr w:type="gramEnd"/>
+            </w:hyperlink>
+          </w:p>
+          <w:p>
+            <w:pPr>
+              <w:rPr>
+                <w:lang w:val="en-US"/>
+              </w:rPr>
+            </w:pPr>
+          </w:p>
+        </w:tc>
+      </w:tr>
+      <w:tr>
+        <w:tc>
+          <w:tcPr>
+            <w:tcW w:w="2144" w:type="dxa"/>
             <w:shd w:val="clear" w:color="auto" w:fill="C1E4F5" w:themeFill="accent1" w:themeFillTint="33"/>
           </w:tcPr>
           <w:p>
@@ -160,49 +717,1801 @@
         </w:tc>
         <w:tc>
           <w:tcPr>
-            <w:tcW w:w="6663" w:type="dxa"/>
+            <w:tcW w:w="6486" w:type="dxa"/>
           </w:tcPr>
-          <w:p>
-            <w:r>
-              <w:rPr>
-                <w:b/>
-                <w:bCs/>
-              </w:rPr>
-              <w:t>Variables</w:t>
-            </w:r>
-            <w:r>
-              <w:t>:</w:t>
-            </w:r>
-            <w:r>
-              <w:t xml:space="preserve"> Region, Agency, Town, Site Name, LAWA Site ID, Site ID, Latitude, Longitude, Site Type, Indicator (PM</w:t>
-            </w:r>
-            <w:proofErr w:type="gramStart"/>
-            <w:r>
-              <w:t>₂.₅</w:t>
-            </w:r>
-            <w:proofErr w:type="gramEnd"/>
-            <w:r>
-              <w:t>/PM₁₀), Sample Date, Concentration (µg/m³)</w:t>
-            </w:r>
-          </w:p>
-          <w:p>
-            <w:r>
-              <w:rPr>
-                <w:b/>
-                <w:bCs/>
-              </w:rPr>
-              <w:t>Format</w:t>
-            </w:r>
-            <w:r>
-              <w:t>: CSV</w:t>
-            </w:r>
+          <w:tbl>
+            <w:tblPr>
+              <w:tblW w:w="5000" w:type="pct"/>
+              <w:tblCellMar>
+                <w:top w:w="15" w:type="dxa"/>
+                <w:left w:w="15" w:type="dxa"/>
+                <w:bottom w:w="15" w:type="dxa"/>
+                <w:right w:w="15" w:type="dxa"/>
+              </w:tblCellMar>
+              <w:tblLook w:val="04A0" w:firstRow="1" w:lastRow="0" w:firstColumn="1" w:lastColumn="0" w:noHBand="0" w:noVBand="1"/>
+            </w:tblPr>
+            <w:tblGrid>
+              <w:gridCol w:w="2027"/>
+              <w:gridCol w:w="4472"/>
+            </w:tblGrid>
+            <w:tr>
+              <w:trPr>
+                <w:tblHeader/>
+              </w:trPr>
+              <w:tc>
+                <w:tcPr>
+                  <w:tcW w:w="0" w:type="auto"/>
+                  <w:tcBorders>
+                    <w:top w:val="single" w:sz="6" w:space="0" w:color="DDDDDD"/>
+                    <w:left w:val="single" w:sz="6" w:space="0" w:color="DDDDDD"/>
+                    <w:bottom w:val="single" w:sz="6" w:space="0" w:color="DDDDDD"/>
+                    <w:right w:val="single" w:sz="6" w:space="0" w:color="DDDDDD"/>
+                  </w:tcBorders>
+                  <w:shd w:val="clear" w:color="auto" w:fill="F2F2F2"/>
+                  <w:tcMar>
+                    <w:top w:w="120" w:type="dxa"/>
+                    <w:left w:w="120" w:type="dxa"/>
+                    <w:bottom w:w="120" w:type="dxa"/>
+                    <w:right w:w="120" w:type="dxa"/>
+                  </w:tcMar>
+                  <w:vAlign w:val="center"/>
+                  <w:hideMark/>
+                </w:tcPr>
+                <w:p>
+                  <w:pPr>
+                    <w:spacing w:after="0" w:line="240" w:lineRule="auto"/>
+                    <w:rPr>
+                      <w:rFonts w:ascii="Arial" w:eastAsia="Times New Roman" w:hAnsi="Arial" w:cs="Arial"/>
+                      <w:b/>
+                      <w:bCs/>
+                      <w:kern w:val="0"/>
+                      <w:lang w:val="en-US" w:eastAsia="ja-JP"/>
+                      <w14:ligatures w14:val="none"/>
+                    </w:rPr>
+                  </w:pPr>
+                  <w:r>
+                    <w:rPr>
+                      <w:rFonts w:ascii="Arial" w:eastAsia="Times New Roman" w:hAnsi="Arial" w:cs="Arial"/>
+                      <w:b/>
+                      <w:bCs/>
+                      <w:kern w:val="0"/>
+                      <w:lang w:val="en-US" w:eastAsia="ja-JP"/>
+                      <w14:ligatures w14:val="none"/>
+                    </w:rPr>
+                    <w:t>Dimension</w:t>
+                  </w:r>
+                </w:p>
+              </w:tc>
+              <w:tc>
+                <w:tcPr>
+                  <w:tcW w:w="0" w:type="auto"/>
+                  <w:tcBorders>
+                    <w:top w:val="single" w:sz="6" w:space="0" w:color="DDDDDD"/>
+                    <w:left w:val="single" w:sz="6" w:space="0" w:color="DDDDDD"/>
+                    <w:bottom w:val="single" w:sz="6" w:space="0" w:color="DDDDDD"/>
+                    <w:right w:val="single" w:sz="6" w:space="0" w:color="DDDDDD"/>
+                  </w:tcBorders>
+                  <w:shd w:val="clear" w:color="auto" w:fill="F2F2F2"/>
+                  <w:tcMar>
+                    <w:top w:w="120" w:type="dxa"/>
+                    <w:left w:w="120" w:type="dxa"/>
+                    <w:bottom w:w="120" w:type="dxa"/>
+                    <w:right w:w="120" w:type="dxa"/>
+                  </w:tcMar>
+                  <w:vAlign w:val="center"/>
+                  <w:hideMark/>
+                </w:tcPr>
+                <w:p>
+                  <w:pPr>
+                    <w:spacing w:after="0" w:line="240" w:lineRule="auto"/>
+                    <w:rPr>
+                      <w:rFonts w:ascii="Arial" w:eastAsia="Times New Roman" w:hAnsi="Arial" w:cs="Arial"/>
+                      <w:b/>
+                      <w:bCs/>
+                      <w:kern w:val="0"/>
+                      <w:lang w:val="en-US" w:eastAsia="ja-JP"/>
+                      <w14:ligatures w14:val="none"/>
+                    </w:rPr>
+                  </w:pPr>
+                  <w:r>
+                    <w:rPr>
+                      <w:rFonts w:ascii="Arial" w:eastAsia="Times New Roman" w:hAnsi="Arial" w:cs="Arial"/>
+                      <w:b/>
+                      <w:bCs/>
+                      <w:kern w:val="0"/>
+                      <w:lang w:val="en-US" w:eastAsia="ja-JP"/>
+                      <w14:ligatures w14:val="none"/>
+                    </w:rPr>
+                    <w:t>NZDep2023 variable</w:t>
+                  </w:r>
+                </w:p>
+              </w:tc>
+            </w:tr>
+            <w:tr>
+              <w:tc>
+                <w:tcPr>
+                  <w:tcW w:w="0" w:type="auto"/>
+                  <w:tcBorders>
+                    <w:top w:val="single" w:sz="6" w:space="0" w:color="DDDDDD"/>
+                    <w:left w:val="single" w:sz="6" w:space="0" w:color="DDDDDD"/>
+                    <w:bottom w:val="single" w:sz="6" w:space="0" w:color="DDDDDD"/>
+                    <w:right w:val="single" w:sz="6" w:space="0" w:color="DDDDDD"/>
+                  </w:tcBorders>
+                  <w:tcMar>
+                    <w:top w:w="120" w:type="dxa"/>
+                    <w:left w:w="120" w:type="dxa"/>
+                    <w:bottom w:w="120" w:type="dxa"/>
+                    <w:right w:w="120" w:type="dxa"/>
+                  </w:tcMar>
+                  <w:vAlign w:val="center"/>
+                  <w:hideMark/>
+                </w:tcPr>
+                <w:p>
+                  <w:pPr>
+                    <w:spacing w:after="0" w:line="240" w:lineRule="auto"/>
+                    <w:rPr>
+                      <w:rFonts w:ascii="Arial" w:eastAsia="Times New Roman" w:hAnsi="Arial" w:cs="Arial"/>
+                      <w:kern w:val="0"/>
+                      <w:lang w:val="en-US" w:eastAsia="ja-JP"/>
+                      <w14:ligatures w14:val="none"/>
+                    </w:rPr>
+                  </w:pPr>
+                  <w:r>
+                    <w:rPr>
+                      <w:rFonts w:ascii="Arial" w:eastAsia="Times New Roman" w:hAnsi="Arial" w:cs="Arial"/>
+                      <w:kern w:val="0"/>
+                      <w:lang w:val="en-US" w:eastAsia="ja-JP"/>
+                      <w14:ligatures w14:val="none"/>
+                    </w:rPr>
+                    <w:t>Communication</w:t>
+                  </w:r>
+                </w:p>
+              </w:tc>
+              <w:tc>
+                <w:tcPr>
+                  <w:tcW w:w="0" w:type="auto"/>
+                  <w:tcBorders>
+                    <w:top w:val="single" w:sz="6" w:space="0" w:color="DDDDDD"/>
+                    <w:left w:val="single" w:sz="6" w:space="0" w:color="DDDDDD"/>
+                    <w:bottom w:val="single" w:sz="6" w:space="0" w:color="DDDDDD"/>
+                    <w:right w:val="single" w:sz="6" w:space="0" w:color="DDDDDD"/>
+                  </w:tcBorders>
+                  <w:tcMar>
+                    <w:top w:w="120" w:type="dxa"/>
+                    <w:left w:w="120" w:type="dxa"/>
+                    <w:bottom w:w="120" w:type="dxa"/>
+                    <w:right w:w="120" w:type="dxa"/>
+                  </w:tcMar>
+                  <w:vAlign w:val="center"/>
+                  <w:hideMark/>
+                </w:tcPr>
+                <w:p>
+                  <w:pPr>
+                    <w:spacing w:after="0" w:line="240" w:lineRule="auto"/>
+                    <w:rPr>
+                      <w:rFonts w:ascii="Arial" w:eastAsia="Times New Roman" w:hAnsi="Arial" w:cs="Arial"/>
+                      <w:kern w:val="0"/>
+                      <w:lang w:val="en-US" w:eastAsia="ja-JP"/>
+                      <w14:ligatures w14:val="none"/>
+                    </w:rPr>
+                  </w:pPr>
+                  <w:r>
+                    <w:rPr>
+                      <w:rFonts w:ascii="Arial" w:eastAsia="Times New Roman" w:hAnsi="Arial" w:cs="Arial"/>
+                      <w:kern w:val="0"/>
+                      <w:lang w:val="en-US" w:eastAsia="ja-JP"/>
+                      <w14:ligatures w14:val="none"/>
+                    </w:rPr>
+                    <w:t>People with no internet access at home</w:t>
+                  </w:r>
+                </w:p>
+              </w:tc>
+            </w:tr>
+            <w:tr>
+              <w:tc>
+                <w:tcPr>
+                  <w:tcW w:w="0" w:type="auto"/>
+                  <w:tcBorders>
+                    <w:top w:val="single" w:sz="6" w:space="0" w:color="DDDDDD"/>
+                    <w:left w:val="single" w:sz="6" w:space="0" w:color="DDDDDD"/>
+                    <w:bottom w:val="single" w:sz="6" w:space="0" w:color="DDDDDD"/>
+                    <w:right w:val="single" w:sz="6" w:space="0" w:color="DDDDDD"/>
+                  </w:tcBorders>
+                  <w:tcMar>
+                    <w:top w:w="120" w:type="dxa"/>
+                    <w:left w:w="120" w:type="dxa"/>
+                    <w:bottom w:w="120" w:type="dxa"/>
+                    <w:right w:w="120" w:type="dxa"/>
+                  </w:tcMar>
+                  <w:vAlign w:val="center"/>
+                  <w:hideMark/>
+                </w:tcPr>
+                <w:p>
+                  <w:pPr>
+                    <w:spacing w:after="0" w:line="240" w:lineRule="auto"/>
+                    <w:rPr>
+                      <w:rFonts w:ascii="Arial" w:eastAsia="Times New Roman" w:hAnsi="Arial" w:cs="Arial"/>
+                      <w:kern w:val="0"/>
+                      <w:lang w:val="en-US" w:eastAsia="ja-JP"/>
+                      <w14:ligatures w14:val="none"/>
+                    </w:rPr>
+                  </w:pPr>
+                  <w:r>
+                    <w:rPr>
+                      <w:rFonts w:ascii="Arial" w:eastAsia="Times New Roman" w:hAnsi="Arial" w:cs="Arial"/>
+                      <w:kern w:val="0"/>
+                      <w:lang w:val="en-US" w:eastAsia="ja-JP"/>
+                      <w14:ligatures w14:val="none"/>
+                    </w:rPr>
+                    <w:t>Income</w:t>
+                  </w:r>
+                </w:p>
+              </w:tc>
+              <w:tc>
+                <w:tcPr>
+                  <w:tcW w:w="0" w:type="auto"/>
+                  <w:tcBorders>
+                    <w:top w:val="single" w:sz="6" w:space="0" w:color="DDDDDD"/>
+                    <w:left w:val="single" w:sz="6" w:space="0" w:color="DDDDDD"/>
+                    <w:bottom w:val="single" w:sz="6" w:space="0" w:color="DDDDDD"/>
+                    <w:right w:val="single" w:sz="6" w:space="0" w:color="DDDDDD"/>
+                  </w:tcBorders>
+                  <w:tcMar>
+                    <w:top w:w="120" w:type="dxa"/>
+                    <w:left w:w="120" w:type="dxa"/>
+                    <w:bottom w:w="120" w:type="dxa"/>
+                    <w:right w:w="120" w:type="dxa"/>
+                  </w:tcMar>
+                  <w:vAlign w:val="center"/>
+                  <w:hideMark/>
+                </w:tcPr>
+                <w:p>
+                  <w:pPr>
+                    <w:spacing w:after="0" w:line="240" w:lineRule="auto"/>
+                    <w:rPr>
+                      <w:rFonts w:ascii="Arial" w:eastAsia="Times New Roman" w:hAnsi="Arial" w:cs="Arial"/>
+                      <w:kern w:val="0"/>
+                      <w:lang w:val="en-US" w:eastAsia="ja-JP"/>
+                      <w14:ligatures w14:val="none"/>
+                    </w:rPr>
+                  </w:pPr>
+                  <w:r>
+                    <w:rPr>
+                      <w:rFonts w:ascii="Arial" w:eastAsia="Times New Roman" w:hAnsi="Arial" w:cs="Arial"/>
+                      <w:kern w:val="0"/>
+                      <w:lang w:val="en-US" w:eastAsia="ja-JP"/>
+                      <w14:ligatures w14:val="none"/>
+                    </w:rPr>
+                    <w:t>People aged 18–64 receiving a means-tested benefit</w:t>
+                  </w:r>
+                </w:p>
+              </w:tc>
+            </w:tr>
+            <w:tr>
+              <w:tc>
+                <w:tcPr>
+                  <w:tcW w:w="0" w:type="auto"/>
+                  <w:tcBorders>
+                    <w:top w:val="single" w:sz="6" w:space="0" w:color="DDDDDD"/>
+                    <w:left w:val="single" w:sz="6" w:space="0" w:color="DDDDDD"/>
+                    <w:bottom w:val="single" w:sz="6" w:space="0" w:color="DDDDDD"/>
+                    <w:right w:val="single" w:sz="6" w:space="0" w:color="DDDDDD"/>
+                  </w:tcBorders>
+                  <w:tcMar>
+                    <w:top w:w="120" w:type="dxa"/>
+                    <w:left w:w="120" w:type="dxa"/>
+                    <w:bottom w:w="120" w:type="dxa"/>
+                    <w:right w:w="120" w:type="dxa"/>
+                  </w:tcMar>
+                  <w:vAlign w:val="center"/>
+                  <w:hideMark/>
+                </w:tcPr>
+                <w:p>
+                  <w:pPr>
+                    <w:spacing w:after="0" w:line="240" w:lineRule="auto"/>
+                    <w:rPr>
+                      <w:rFonts w:ascii="Arial" w:eastAsia="Times New Roman" w:hAnsi="Arial" w:cs="Arial"/>
+                      <w:kern w:val="0"/>
+                      <w:lang w:val="en-US" w:eastAsia="ja-JP"/>
+                      <w14:ligatures w14:val="none"/>
+                    </w:rPr>
+                  </w:pPr>
+                  <w:r>
+                    <w:rPr>
+                      <w:rFonts w:ascii="Arial" w:eastAsia="Times New Roman" w:hAnsi="Arial" w:cs="Arial"/>
+                      <w:kern w:val="0"/>
+                      <w:lang w:val="en-US" w:eastAsia="ja-JP"/>
+                      <w14:ligatures w14:val="none"/>
+                    </w:rPr>
+                    <w:lastRenderedPageBreak/>
+                    <w:t>Income</w:t>
+                  </w:r>
+                </w:p>
+              </w:tc>
+              <w:tc>
+                <w:tcPr>
+                  <w:tcW w:w="0" w:type="auto"/>
+                  <w:tcBorders>
+                    <w:top w:val="single" w:sz="6" w:space="0" w:color="DDDDDD"/>
+                    <w:left w:val="single" w:sz="6" w:space="0" w:color="DDDDDD"/>
+                    <w:bottom w:val="single" w:sz="6" w:space="0" w:color="DDDDDD"/>
+                    <w:right w:val="single" w:sz="6" w:space="0" w:color="DDDDDD"/>
+                  </w:tcBorders>
+                  <w:tcMar>
+                    <w:top w:w="120" w:type="dxa"/>
+                    <w:left w:w="120" w:type="dxa"/>
+                    <w:bottom w:w="120" w:type="dxa"/>
+                    <w:right w:w="120" w:type="dxa"/>
+                  </w:tcMar>
+                  <w:vAlign w:val="center"/>
+                  <w:hideMark/>
+                </w:tcPr>
+                <w:p>
+                  <w:pPr>
+                    <w:spacing w:after="0" w:line="240" w:lineRule="auto"/>
+                    <w:rPr>
+                      <w:rFonts w:ascii="Arial" w:eastAsia="Times New Roman" w:hAnsi="Arial" w:cs="Arial"/>
+                      <w:kern w:val="0"/>
+                      <w:lang w:val="en-US" w:eastAsia="ja-JP"/>
+                      <w14:ligatures w14:val="none"/>
+                    </w:rPr>
+                  </w:pPr>
+                  <w:r>
+                    <w:rPr>
+                      <w:rFonts w:ascii="Arial" w:eastAsia="Times New Roman" w:hAnsi="Arial" w:cs="Arial"/>
+                      <w:kern w:val="0"/>
+                      <w:lang w:val="en-US" w:eastAsia="ja-JP"/>
+                      <w14:ligatures w14:val="none"/>
+                    </w:rPr>
+                    <w:t xml:space="preserve">People in </w:t>
+                  </w:r>
+                  <w:proofErr w:type="spellStart"/>
+                  <w:r>
+                    <w:rPr>
+                      <w:rFonts w:ascii="Arial" w:eastAsia="Times New Roman" w:hAnsi="Arial" w:cs="Arial"/>
+                      <w:kern w:val="0"/>
+                      <w:lang w:val="en-US" w:eastAsia="ja-JP"/>
+                      <w14:ligatures w14:val="none"/>
+                    </w:rPr>
+                    <w:t>equivalised</w:t>
+                  </w:r>
+                  <w:proofErr w:type="spellEnd"/>
+                  <w:r>
+                    <w:rPr>
+                      <w:rFonts w:ascii="Arial" w:eastAsia="Times New Roman" w:hAnsi="Arial" w:cs="Arial"/>
+                      <w:kern w:val="0"/>
+                      <w:lang w:val="en-US" w:eastAsia="ja-JP"/>
+                      <w14:ligatures w14:val="none"/>
+                    </w:rPr>
+                    <w:t xml:space="preserve"> households below an income threshold</w:t>
+                  </w:r>
+                </w:p>
+              </w:tc>
+            </w:tr>
+            <w:tr>
+              <w:tc>
+                <w:tcPr>
+                  <w:tcW w:w="0" w:type="auto"/>
+                  <w:tcBorders>
+                    <w:top w:val="single" w:sz="6" w:space="0" w:color="DDDDDD"/>
+                    <w:left w:val="single" w:sz="6" w:space="0" w:color="DDDDDD"/>
+                    <w:bottom w:val="single" w:sz="6" w:space="0" w:color="DDDDDD"/>
+                    <w:right w:val="single" w:sz="6" w:space="0" w:color="DDDDDD"/>
+                  </w:tcBorders>
+                  <w:tcMar>
+                    <w:top w:w="120" w:type="dxa"/>
+                    <w:left w:w="120" w:type="dxa"/>
+                    <w:bottom w:w="120" w:type="dxa"/>
+                    <w:right w:w="120" w:type="dxa"/>
+                  </w:tcMar>
+                  <w:vAlign w:val="center"/>
+                  <w:hideMark/>
+                </w:tcPr>
+                <w:p>
+                  <w:pPr>
+                    <w:spacing w:after="0" w:line="240" w:lineRule="auto"/>
+                    <w:rPr>
+                      <w:rFonts w:ascii="Arial" w:eastAsia="Times New Roman" w:hAnsi="Arial" w:cs="Arial"/>
+                      <w:kern w:val="0"/>
+                      <w:lang w:val="en-US" w:eastAsia="ja-JP"/>
+                      <w14:ligatures w14:val="none"/>
+                    </w:rPr>
+                  </w:pPr>
+                  <w:r>
+                    <w:rPr>
+                      <w:rFonts w:ascii="Arial" w:eastAsia="Times New Roman" w:hAnsi="Arial" w:cs="Arial"/>
+                      <w:kern w:val="0"/>
+                      <w:lang w:val="en-US" w:eastAsia="ja-JP"/>
+                      <w14:ligatures w14:val="none"/>
+                    </w:rPr>
+                    <w:t>Employment</w:t>
+                  </w:r>
+                </w:p>
+              </w:tc>
+              <w:tc>
+                <w:tcPr>
+                  <w:tcW w:w="0" w:type="auto"/>
+                  <w:tcBorders>
+                    <w:top w:val="single" w:sz="6" w:space="0" w:color="DDDDDD"/>
+                    <w:left w:val="single" w:sz="6" w:space="0" w:color="DDDDDD"/>
+                    <w:bottom w:val="single" w:sz="6" w:space="0" w:color="DDDDDD"/>
+                    <w:right w:val="single" w:sz="6" w:space="0" w:color="DDDDDD"/>
+                  </w:tcBorders>
+                  <w:tcMar>
+                    <w:top w:w="120" w:type="dxa"/>
+                    <w:left w:w="120" w:type="dxa"/>
+                    <w:bottom w:w="120" w:type="dxa"/>
+                    <w:right w:w="120" w:type="dxa"/>
+                  </w:tcMar>
+                  <w:vAlign w:val="center"/>
+                  <w:hideMark/>
+                </w:tcPr>
+                <w:p>
+                  <w:pPr>
+                    <w:spacing w:after="0" w:line="240" w:lineRule="auto"/>
+                    <w:rPr>
+                      <w:rFonts w:ascii="Arial" w:eastAsia="Times New Roman" w:hAnsi="Arial" w:cs="Arial"/>
+                      <w:kern w:val="0"/>
+                      <w:lang w:val="en-US" w:eastAsia="ja-JP"/>
+                      <w14:ligatures w14:val="none"/>
+                    </w:rPr>
+                  </w:pPr>
+                  <w:r>
+                    <w:rPr>
+                      <w:rFonts w:ascii="Arial" w:eastAsia="Times New Roman" w:hAnsi="Arial" w:cs="Arial"/>
+                      <w:kern w:val="0"/>
+                      <w:lang w:val="en-US" w:eastAsia="ja-JP"/>
+                      <w14:ligatures w14:val="none"/>
+                    </w:rPr>
+                    <w:t>People aged 18–64 who are unemployed</w:t>
+                  </w:r>
+                </w:p>
+              </w:tc>
+            </w:tr>
+            <w:tr>
+              <w:tc>
+                <w:tcPr>
+                  <w:tcW w:w="0" w:type="auto"/>
+                  <w:tcBorders>
+                    <w:top w:val="single" w:sz="6" w:space="0" w:color="DDDDDD"/>
+                    <w:left w:val="single" w:sz="6" w:space="0" w:color="DDDDDD"/>
+                    <w:bottom w:val="single" w:sz="6" w:space="0" w:color="DDDDDD"/>
+                    <w:right w:val="single" w:sz="6" w:space="0" w:color="DDDDDD"/>
+                  </w:tcBorders>
+                  <w:tcMar>
+                    <w:top w:w="120" w:type="dxa"/>
+                    <w:left w:w="120" w:type="dxa"/>
+                    <w:bottom w:w="120" w:type="dxa"/>
+                    <w:right w:w="120" w:type="dxa"/>
+                  </w:tcMar>
+                  <w:vAlign w:val="center"/>
+                  <w:hideMark/>
+                </w:tcPr>
+                <w:p>
+                  <w:pPr>
+                    <w:spacing w:after="0" w:line="240" w:lineRule="auto"/>
+                    <w:rPr>
+                      <w:rFonts w:ascii="Arial" w:eastAsia="Times New Roman" w:hAnsi="Arial" w:cs="Arial"/>
+                      <w:kern w:val="0"/>
+                      <w:lang w:val="en-US" w:eastAsia="ja-JP"/>
+                      <w14:ligatures w14:val="none"/>
+                    </w:rPr>
+                  </w:pPr>
+                  <w:r>
+                    <w:rPr>
+                      <w:rFonts w:ascii="Arial" w:eastAsia="Times New Roman" w:hAnsi="Arial" w:cs="Arial"/>
+                      <w:kern w:val="0"/>
+                      <w:lang w:val="en-US" w:eastAsia="ja-JP"/>
+                      <w14:ligatures w14:val="none"/>
+                    </w:rPr>
+                    <w:t>Qualifications</w:t>
+                  </w:r>
+                </w:p>
+              </w:tc>
+              <w:tc>
+                <w:tcPr>
+                  <w:tcW w:w="0" w:type="auto"/>
+                  <w:tcBorders>
+                    <w:top w:val="single" w:sz="6" w:space="0" w:color="DDDDDD"/>
+                    <w:left w:val="single" w:sz="6" w:space="0" w:color="DDDDDD"/>
+                    <w:bottom w:val="single" w:sz="6" w:space="0" w:color="DDDDDD"/>
+                    <w:right w:val="single" w:sz="6" w:space="0" w:color="DDDDDD"/>
+                  </w:tcBorders>
+                  <w:tcMar>
+                    <w:top w:w="120" w:type="dxa"/>
+                    <w:left w:w="120" w:type="dxa"/>
+                    <w:bottom w:w="120" w:type="dxa"/>
+                    <w:right w:w="120" w:type="dxa"/>
+                  </w:tcMar>
+                  <w:vAlign w:val="center"/>
+                  <w:hideMark/>
+                </w:tcPr>
+                <w:p>
+                  <w:pPr>
+                    <w:spacing w:after="0" w:line="240" w:lineRule="auto"/>
+                    <w:rPr>
+                      <w:rFonts w:ascii="Arial" w:eastAsia="Times New Roman" w:hAnsi="Arial" w:cs="Arial"/>
+                      <w:kern w:val="0"/>
+                      <w:lang w:val="en-US" w:eastAsia="ja-JP"/>
+                      <w14:ligatures w14:val="none"/>
+                    </w:rPr>
+                  </w:pPr>
+                  <w:r>
+                    <w:rPr>
+                      <w:rFonts w:ascii="Arial" w:eastAsia="Times New Roman" w:hAnsi="Arial" w:cs="Arial"/>
+                      <w:kern w:val="0"/>
+                      <w:lang w:val="en-US" w:eastAsia="ja-JP"/>
+                      <w14:ligatures w14:val="none"/>
+                    </w:rPr>
+                    <w:t>People aged 18–64 with no qualifications</w:t>
+                  </w:r>
+                </w:p>
+              </w:tc>
+            </w:tr>
+            <w:tr>
+              <w:tc>
+                <w:tcPr>
+                  <w:tcW w:w="0" w:type="auto"/>
+                  <w:tcBorders>
+                    <w:top w:val="single" w:sz="6" w:space="0" w:color="DDDDDD"/>
+                    <w:left w:val="single" w:sz="6" w:space="0" w:color="DDDDDD"/>
+                    <w:bottom w:val="single" w:sz="6" w:space="0" w:color="DDDDDD"/>
+                    <w:right w:val="single" w:sz="6" w:space="0" w:color="DDDDDD"/>
+                  </w:tcBorders>
+                  <w:tcMar>
+                    <w:top w:w="120" w:type="dxa"/>
+                    <w:left w:w="120" w:type="dxa"/>
+                    <w:bottom w:w="120" w:type="dxa"/>
+                    <w:right w:w="120" w:type="dxa"/>
+                  </w:tcMar>
+                  <w:vAlign w:val="center"/>
+                  <w:hideMark/>
+                </w:tcPr>
+                <w:p>
+                  <w:pPr>
+                    <w:spacing w:after="0" w:line="240" w:lineRule="auto"/>
+                    <w:rPr>
+                      <w:rFonts w:ascii="Arial" w:eastAsia="Times New Roman" w:hAnsi="Arial" w:cs="Arial"/>
+                      <w:kern w:val="0"/>
+                      <w:lang w:val="en-US" w:eastAsia="ja-JP"/>
+                      <w14:ligatures w14:val="none"/>
+                    </w:rPr>
+                  </w:pPr>
+                  <w:r>
+                    <w:rPr>
+                      <w:rFonts w:ascii="Arial" w:eastAsia="Times New Roman" w:hAnsi="Arial" w:cs="Arial"/>
+                      <w:kern w:val="0"/>
+                      <w:lang w:val="en-US" w:eastAsia="ja-JP"/>
+                      <w14:ligatures w14:val="none"/>
+                    </w:rPr>
+                    <w:t>Home ownership</w:t>
+                  </w:r>
+                </w:p>
+              </w:tc>
+              <w:tc>
+                <w:tcPr>
+                  <w:tcW w:w="0" w:type="auto"/>
+                  <w:tcBorders>
+                    <w:top w:val="single" w:sz="6" w:space="0" w:color="DDDDDD"/>
+                    <w:left w:val="single" w:sz="6" w:space="0" w:color="DDDDDD"/>
+                    <w:bottom w:val="single" w:sz="6" w:space="0" w:color="DDDDDD"/>
+                    <w:right w:val="single" w:sz="6" w:space="0" w:color="DDDDDD"/>
+                  </w:tcBorders>
+                  <w:tcMar>
+                    <w:top w:w="120" w:type="dxa"/>
+                    <w:left w:w="120" w:type="dxa"/>
+                    <w:bottom w:w="120" w:type="dxa"/>
+                    <w:right w:w="120" w:type="dxa"/>
+                  </w:tcMar>
+                  <w:vAlign w:val="center"/>
+                  <w:hideMark/>
+                </w:tcPr>
+                <w:p>
+                  <w:pPr>
+                    <w:spacing w:after="0" w:line="240" w:lineRule="auto"/>
+                    <w:rPr>
+                      <w:rFonts w:ascii="Arial" w:eastAsia="Times New Roman" w:hAnsi="Arial" w:cs="Arial"/>
+                      <w:kern w:val="0"/>
+                      <w:lang w:val="en-US" w:eastAsia="ja-JP"/>
+                      <w14:ligatures w14:val="none"/>
+                    </w:rPr>
+                  </w:pPr>
+                  <w:r>
+                    <w:rPr>
+                      <w:rFonts w:ascii="Arial" w:eastAsia="Times New Roman" w:hAnsi="Arial" w:cs="Arial"/>
+                      <w:kern w:val="0"/>
+                      <w:lang w:val="en-US" w:eastAsia="ja-JP"/>
+                      <w14:ligatures w14:val="none"/>
+                    </w:rPr>
+                    <w:t>People not living in their own home</w:t>
+                  </w:r>
+                </w:p>
+              </w:tc>
+            </w:tr>
+            <w:tr>
+              <w:tc>
+                <w:tcPr>
+                  <w:tcW w:w="0" w:type="auto"/>
+                  <w:tcBorders>
+                    <w:top w:val="single" w:sz="6" w:space="0" w:color="DDDDDD"/>
+                    <w:left w:val="single" w:sz="6" w:space="0" w:color="DDDDDD"/>
+                    <w:bottom w:val="single" w:sz="6" w:space="0" w:color="DDDDDD"/>
+                    <w:right w:val="single" w:sz="6" w:space="0" w:color="DDDDDD"/>
+                  </w:tcBorders>
+                  <w:tcMar>
+                    <w:top w:w="120" w:type="dxa"/>
+                    <w:left w:w="120" w:type="dxa"/>
+                    <w:bottom w:w="120" w:type="dxa"/>
+                    <w:right w:w="120" w:type="dxa"/>
+                  </w:tcMar>
+                  <w:vAlign w:val="center"/>
+                  <w:hideMark/>
+                </w:tcPr>
+                <w:p>
+                  <w:pPr>
+                    <w:spacing w:after="0" w:line="240" w:lineRule="auto"/>
+                    <w:rPr>
+                      <w:rFonts w:ascii="Arial" w:eastAsia="Times New Roman" w:hAnsi="Arial" w:cs="Arial"/>
+                      <w:kern w:val="0"/>
+                      <w:lang w:val="en-US" w:eastAsia="ja-JP"/>
+                      <w14:ligatures w14:val="none"/>
+                    </w:rPr>
+                  </w:pPr>
+                  <w:r>
+                    <w:rPr>
+                      <w:rFonts w:ascii="Arial" w:eastAsia="Times New Roman" w:hAnsi="Arial" w:cs="Arial"/>
+                      <w:kern w:val="0"/>
+                      <w:lang w:val="en-US" w:eastAsia="ja-JP"/>
+                      <w14:ligatures w14:val="none"/>
+                    </w:rPr>
+                    <w:t>Support</w:t>
+                  </w:r>
+                </w:p>
+              </w:tc>
+              <w:tc>
+                <w:tcPr>
+                  <w:tcW w:w="0" w:type="auto"/>
+                  <w:tcBorders>
+                    <w:top w:val="single" w:sz="6" w:space="0" w:color="DDDDDD"/>
+                    <w:left w:val="single" w:sz="6" w:space="0" w:color="DDDDDD"/>
+                    <w:bottom w:val="single" w:sz="6" w:space="0" w:color="DDDDDD"/>
+                    <w:right w:val="single" w:sz="6" w:space="0" w:color="DDDDDD"/>
+                  </w:tcBorders>
+                  <w:tcMar>
+                    <w:top w:w="120" w:type="dxa"/>
+                    <w:left w:w="120" w:type="dxa"/>
+                    <w:bottom w:w="120" w:type="dxa"/>
+                    <w:right w:w="120" w:type="dxa"/>
+                  </w:tcMar>
+                  <w:vAlign w:val="center"/>
+                  <w:hideMark/>
+                </w:tcPr>
+                <w:p>
+                  <w:pPr>
+                    <w:spacing w:after="0" w:line="240" w:lineRule="auto"/>
+                    <w:rPr>
+                      <w:rFonts w:ascii="Arial" w:eastAsia="Times New Roman" w:hAnsi="Arial" w:cs="Arial"/>
+                      <w:kern w:val="0"/>
+                      <w:lang w:val="en-US" w:eastAsia="ja-JP"/>
+                      <w14:ligatures w14:val="none"/>
+                    </w:rPr>
+                  </w:pPr>
+                  <w:r>
+                    <w:rPr>
+                      <w:rFonts w:ascii="Arial" w:eastAsia="Times New Roman" w:hAnsi="Arial" w:cs="Arial"/>
+                      <w:kern w:val="0"/>
+                      <w:lang w:val="en-US" w:eastAsia="ja-JP"/>
+                      <w14:ligatures w14:val="none"/>
+                    </w:rPr>
+                    <w:t xml:space="preserve">People aged under 75 </w:t>
+                  </w:r>
+                  <w:proofErr w:type="gramStart"/>
+                  <w:r>
+                    <w:rPr>
+                      <w:rFonts w:ascii="Arial" w:eastAsia="Times New Roman" w:hAnsi="Arial" w:cs="Arial"/>
+                      <w:kern w:val="0"/>
+                      <w:lang w:val="en-US" w:eastAsia="ja-JP"/>
+                      <w14:ligatures w14:val="none"/>
+                    </w:rPr>
+                    <w:t>living</w:t>
+                  </w:r>
+                  <w:proofErr w:type="gramEnd"/>
+                  <w:r>
+                    <w:rPr>
+                      <w:rFonts w:ascii="Arial" w:eastAsia="Times New Roman" w:hAnsi="Arial" w:cs="Arial"/>
+                      <w:kern w:val="0"/>
+                      <w:lang w:val="en-US" w:eastAsia="ja-JP"/>
+                      <w14:ligatures w14:val="none"/>
+                    </w:rPr>
+                    <w:t xml:space="preserve"> in a sole-parent family</w:t>
+                  </w:r>
+                </w:p>
+              </w:tc>
+            </w:tr>
+            <w:tr>
+              <w:tc>
+                <w:tcPr>
+                  <w:tcW w:w="0" w:type="auto"/>
+                  <w:tcBorders>
+                    <w:top w:val="single" w:sz="6" w:space="0" w:color="DDDDDD"/>
+                    <w:left w:val="single" w:sz="6" w:space="0" w:color="DDDDDD"/>
+                    <w:bottom w:val="single" w:sz="6" w:space="0" w:color="DDDDDD"/>
+                    <w:right w:val="single" w:sz="6" w:space="0" w:color="DDDDDD"/>
+                  </w:tcBorders>
+                  <w:tcMar>
+                    <w:top w:w="120" w:type="dxa"/>
+                    <w:left w:w="120" w:type="dxa"/>
+                    <w:bottom w:w="120" w:type="dxa"/>
+                    <w:right w:w="120" w:type="dxa"/>
+                  </w:tcMar>
+                  <w:vAlign w:val="center"/>
+                  <w:hideMark/>
+                </w:tcPr>
+                <w:p>
+                  <w:pPr>
+                    <w:spacing w:after="0" w:line="240" w:lineRule="auto"/>
+                    <w:rPr>
+                      <w:rFonts w:ascii="Arial" w:eastAsia="Times New Roman" w:hAnsi="Arial" w:cs="Arial"/>
+                      <w:kern w:val="0"/>
+                      <w:lang w:val="en-US" w:eastAsia="ja-JP"/>
+                      <w14:ligatures w14:val="none"/>
+                    </w:rPr>
+                  </w:pPr>
+                  <w:r>
+                    <w:rPr>
+                      <w:rFonts w:ascii="Arial" w:eastAsia="Times New Roman" w:hAnsi="Arial" w:cs="Arial"/>
+                      <w:kern w:val="0"/>
+                      <w:lang w:val="en-US" w:eastAsia="ja-JP"/>
+                      <w14:ligatures w14:val="none"/>
+                    </w:rPr>
+                    <w:t>Living space</w:t>
+                  </w:r>
+                </w:p>
+              </w:tc>
+              <w:tc>
+                <w:tcPr>
+                  <w:tcW w:w="0" w:type="auto"/>
+                  <w:tcBorders>
+                    <w:top w:val="single" w:sz="6" w:space="0" w:color="DDDDDD"/>
+                    <w:left w:val="single" w:sz="6" w:space="0" w:color="DDDDDD"/>
+                    <w:bottom w:val="single" w:sz="6" w:space="0" w:color="DDDDDD"/>
+                    <w:right w:val="single" w:sz="6" w:space="0" w:color="DDDDDD"/>
+                  </w:tcBorders>
+                  <w:tcMar>
+                    <w:top w:w="120" w:type="dxa"/>
+                    <w:left w:w="120" w:type="dxa"/>
+                    <w:bottom w:w="120" w:type="dxa"/>
+                    <w:right w:w="120" w:type="dxa"/>
+                  </w:tcMar>
+                  <w:vAlign w:val="center"/>
+                  <w:hideMark/>
+                </w:tcPr>
+                <w:p>
+                  <w:pPr>
+                    <w:spacing w:after="0" w:line="240" w:lineRule="auto"/>
+                    <w:rPr>
+                      <w:rFonts w:ascii="Arial" w:eastAsia="Times New Roman" w:hAnsi="Arial" w:cs="Arial"/>
+                      <w:kern w:val="0"/>
+                      <w:lang w:val="en-US" w:eastAsia="ja-JP"/>
+                      <w14:ligatures w14:val="none"/>
+                    </w:rPr>
+                  </w:pPr>
+                  <w:r>
+                    <w:rPr>
+                      <w:rFonts w:ascii="Arial" w:eastAsia="Times New Roman" w:hAnsi="Arial" w:cs="Arial"/>
+                      <w:kern w:val="0"/>
+                      <w:lang w:val="en-US" w:eastAsia="ja-JP"/>
+                      <w14:ligatures w14:val="none"/>
+                    </w:rPr>
+                    <w:t xml:space="preserve">People in </w:t>
+                  </w:r>
+                  <w:proofErr w:type="spellStart"/>
+                  <w:r>
+                    <w:rPr>
+                      <w:rFonts w:ascii="Arial" w:eastAsia="Times New Roman" w:hAnsi="Arial" w:cs="Arial"/>
+                      <w:kern w:val="0"/>
+                      <w:lang w:val="en-US" w:eastAsia="ja-JP"/>
+                      <w14:ligatures w14:val="none"/>
+                    </w:rPr>
+                    <w:t>equivalised</w:t>
+                  </w:r>
+                  <w:proofErr w:type="spellEnd"/>
+                  <w:r>
+                    <w:rPr>
+                      <w:rFonts w:ascii="Arial" w:eastAsia="Times New Roman" w:hAnsi="Arial" w:cs="Arial"/>
+                      <w:kern w:val="0"/>
+                      <w:lang w:val="en-US" w:eastAsia="ja-JP"/>
+                      <w14:ligatures w14:val="none"/>
+                    </w:rPr>
+                    <w:t xml:space="preserve"> households below a bedroom-occupancy threshold</w:t>
+                  </w:r>
+                </w:p>
+              </w:tc>
+            </w:tr>
+            <w:tr>
+              <w:tc>
+                <w:tcPr>
+                  <w:tcW w:w="0" w:type="auto"/>
+                  <w:tcBorders>
+                    <w:top w:val="single" w:sz="6" w:space="0" w:color="DDDDDD"/>
+                    <w:left w:val="single" w:sz="6" w:space="0" w:color="DDDDDD"/>
+                    <w:bottom w:val="single" w:sz="6" w:space="0" w:color="DDDDDD"/>
+                    <w:right w:val="single" w:sz="6" w:space="0" w:color="DDDDDD"/>
+                  </w:tcBorders>
+                  <w:tcMar>
+                    <w:top w:w="120" w:type="dxa"/>
+                    <w:left w:w="120" w:type="dxa"/>
+                    <w:bottom w:w="120" w:type="dxa"/>
+                    <w:right w:w="120" w:type="dxa"/>
+                  </w:tcMar>
+                  <w:vAlign w:val="center"/>
+                  <w:hideMark/>
+                </w:tcPr>
+                <w:p>
+                  <w:pPr>
+                    <w:spacing w:after="0" w:line="240" w:lineRule="auto"/>
+                    <w:rPr>
+                      <w:rFonts w:ascii="Arial" w:eastAsia="Times New Roman" w:hAnsi="Arial" w:cs="Arial"/>
+                      <w:kern w:val="0"/>
+                      <w:lang w:val="en-US" w:eastAsia="ja-JP"/>
+                      <w14:ligatures w14:val="none"/>
+                    </w:rPr>
+                  </w:pPr>
+                  <w:r>
+                    <w:rPr>
+                      <w:rFonts w:ascii="Arial" w:eastAsia="Times New Roman" w:hAnsi="Arial" w:cs="Arial"/>
+                      <w:kern w:val="0"/>
+                      <w:lang w:val="en-US" w:eastAsia="ja-JP"/>
+                      <w14:ligatures w14:val="none"/>
+                    </w:rPr>
+                    <w:t>Dwelling condition</w:t>
+                  </w:r>
+                </w:p>
+              </w:tc>
+              <w:tc>
+                <w:tcPr>
+                  <w:tcW w:w="0" w:type="auto"/>
+                  <w:tcBorders>
+                    <w:top w:val="single" w:sz="6" w:space="0" w:color="DDDDDD"/>
+                    <w:left w:val="single" w:sz="6" w:space="0" w:color="DDDDDD"/>
+                    <w:bottom w:val="single" w:sz="6" w:space="0" w:color="DDDDDD"/>
+                    <w:right w:val="single" w:sz="6" w:space="0" w:color="DDDDDD"/>
+                  </w:tcBorders>
+                  <w:tcMar>
+                    <w:top w:w="120" w:type="dxa"/>
+                    <w:left w:w="120" w:type="dxa"/>
+                    <w:bottom w:w="120" w:type="dxa"/>
+                    <w:right w:w="120" w:type="dxa"/>
+                  </w:tcMar>
+                  <w:vAlign w:val="center"/>
+                  <w:hideMark/>
+                </w:tcPr>
+                <w:p>
+                  <w:pPr>
+                    <w:spacing w:after="0" w:line="240" w:lineRule="auto"/>
+                    <w:rPr>
+                      <w:rFonts w:ascii="Arial" w:eastAsia="Times New Roman" w:hAnsi="Arial" w:cs="Arial"/>
+                      <w:kern w:val="0"/>
+                      <w:lang w:val="en-US" w:eastAsia="ja-JP"/>
+                      <w14:ligatures w14:val="none"/>
+                    </w:rPr>
+                  </w:pPr>
+                  <w:r>
+                    <w:rPr>
+                      <w:rFonts w:ascii="Arial" w:eastAsia="Times New Roman" w:hAnsi="Arial" w:cs="Arial"/>
+                      <w:kern w:val="0"/>
+                      <w:lang w:val="en-US" w:eastAsia="ja-JP"/>
+                      <w14:ligatures w14:val="none"/>
+                    </w:rPr>
+                    <w:t xml:space="preserve">People in dwellings </w:t>
+                  </w:r>
+                  <w:proofErr w:type="gramStart"/>
+                  <w:r>
+                    <w:rPr>
+                      <w:rFonts w:ascii="Arial" w:eastAsia="Times New Roman" w:hAnsi="Arial" w:cs="Arial"/>
+                      <w:kern w:val="0"/>
+                      <w:lang w:val="en-US" w:eastAsia="ja-JP"/>
+                      <w14:ligatures w14:val="none"/>
+                    </w:rPr>
+                    <w:t>always</w:t>
+                  </w:r>
+                  <w:proofErr w:type="gramEnd"/>
+                  <w:r>
+                    <w:rPr>
+                      <w:rFonts w:ascii="Arial" w:eastAsia="Times New Roman" w:hAnsi="Arial" w:cs="Arial"/>
+                      <w:kern w:val="0"/>
+                      <w:lang w:val="en-US" w:eastAsia="ja-JP"/>
+                      <w14:ligatures w14:val="none"/>
+                    </w:rPr>
+                    <w:t xml:space="preserve"> damp and/or with </w:t>
+                  </w:r>
+                  <w:proofErr w:type="spellStart"/>
+                  <w:r>
+                    <w:rPr>
+                      <w:rFonts w:ascii="Arial" w:eastAsia="Times New Roman" w:hAnsi="Arial" w:cs="Arial"/>
+                      <w:kern w:val="0"/>
+                      <w:lang w:val="en-US" w:eastAsia="ja-JP"/>
+                      <w14:ligatures w14:val="none"/>
+                    </w:rPr>
+                    <w:t>mould</w:t>
+                  </w:r>
+                  <w:proofErr w:type="spellEnd"/>
+                  <w:r>
+                    <w:rPr>
+                      <w:rFonts w:ascii="Arial" w:eastAsia="Times New Roman" w:hAnsi="Arial" w:cs="Arial"/>
+                      <w:kern w:val="0"/>
+                      <w:lang w:val="en-US" w:eastAsia="ja-JP"/>
+                      <w14:ligatures w14:val="none"/>
+                    </w:rPr>
+                    <w:t xml:space="preserve"> larger than A4 size</w:t>
+                  </w:r>
+                </w:p>
+              </w:tc>
+            </w:tr>
+          </w:tbl>
+          <w:p>
+            <w:pPr>
+              <w:rPr>
+                <w:lang w:val="en-US"/>
+              </w:rPr>
+            </w:pPr>
           </w:p>
         </w:tc>
       </w:tr>
     </w:tbl>
     <w:p>
       <w:pPr>
+        <w:rPr>
+          <w:rFonts w:ascii="Aharoni" w:eastAsiaTheme="majorEastAsia" w:hAnsi="Aharoni" w:cstheme="majorBidi"/>
+          <w:b/>
+          <w:bCs/>
+          <w:color w:val="00B0F0"/>
+          <w:sz w:val="32"/>
+          <w:szCs w:val="32"/>
+          <w:lang w:val="en-US" w:eastAsia="ja-JP"/>
+        </w:rPr>
+      </w:pPr>
+      <w:r>
+        <w:rPr>
+          <w:lang w:val="en-US" w:eastAsia="ja-JP"/>
+        </w:rPr>
+        <w:lastRenderedPageBreak/>
+        <w:t xml:space="preserve">I notice that there are limitations to NZDEP, as they use pure PCA results -&gt; </w:t>
+      </w:r>
+    </w:p>
+    <w:p>
+      <w:pPr>
+        <w:rPr>
+          <w:rFonts w:ascii="Aharoni" w:eastAsiaTheme="majorEastAsia" w:hAnsi="Aharoni" w:cstheme="majorBidi"/>
+          <w:b/>
+          <w:bCs/>
+          <w:color w:val="00B0F0"/>
+          <w:sz w:val="32"/>
+          <w:szCs w:val="32"/>
+          <w:lang w:val="en-US" w:eastAsia="ja-JP"/>
+        </w:rPr>
+      </w:pPr>
+    </w:p>
+    <w:p>
+      <w:pPr>
+        <w:rPr>
+          <w:rFonts w:ascii="Aharoni" w:eastAsiaTheme="majorEastAsia" w:hAnsi="Aharoni" w:cstheme="majorBidi"/>
+          <w:b/>
+          <w:bCs/>
+          <w:color w:val="00B0F0"/>
+          <w:sz w:val="32"/>
+          <w:szCs w:val="32"/>
+          <w:lang w:val="en-US" w:eastAsia="ja-JP"/>
+        </w:rPr>
+      </w:pPr>
+    </w:p>
+    <w:p>
+      <w:pPr>
         <w:pStyle w:val="Heading2"/>
+      </w:pPr>
+      <w:r>
+        <w:t>2023 Census totals by topic for individuals by statistical area 2 – part </w:t>
+      </w:r>
+      <w:r>
+        <w:t>1</w:t>
+      </w:r>
+    </w:p>
+    <w:p>
+      <w:pPr>
+        <w:rPr>
+          <w:lang w:val="en-US" w:eastAsia="ja-JP"/>
+        </w:rPr>
+      </w:pPr>
+    </w:p>
+    <w:tbl>
+      <w:tblPr>
+        <w:tblStyle w:val="TableGrid"/>
+        <w:tblW w:w="0" w:type="auto"/>
+        <w:tblInd w:w="720" w:type="dxa"/>
+        <w:tblLook w:val="04A0" w:firstRow="1" w:lastRow="0" w:firstColumn="1" w:lastColumn="0" w:noHBand="0" w:noVBand="1"/>
+      </w:tblPr>
+      <w:tblGrid>
+        <w:gridCol w:w="2144"/>
+        <w:gridCol w:w="6486"/>
+      </w:tblGrid>
+      <w:tr>
+        <w:tc>
+          <w:tcPr>
+            <w:tcW w:w="2144" w:type="dxa"/>
+            <w:shd w:val="clear" w:color="auto" w:fill="C1E4F5" w:themeFill="accent1" w:themeFillTint="33"/>
+          </w:tcPr>
+          <w:p>
+            <w:r>
+              <w:t>Source</w:t>
+            </w:r>
+          </w:p>
+        </w:tc>
+        <w:tc>
+          <w:tcPr>
+            <w:tcW w:w="6486" w:type="dxa"/>
+          </w:tcPr>
+          <w:p>
+            <w:pPr>
+              <w:rPr>
+                <w:lang w:val="en-US"/>
+              </w:rPr>
+            </w:pPr>
+            <w:r>
+              <w:rPr>
+                <w:lang w:val="en-US"/>
+              </w:rPr>
+              <w:t xml:space="preserve">STATSNZ </w:t>
+            </w:r>
+          </w:p>
+          <w:p>
+            <w:pPr>
+              <w:rPr>
+                <w:lang w:val="en-US"/>
+              </w:rPr>
+            </w:pPr>
+          </w:p>
+          <w:p>
+            <w:pPr>
+              <w:rPr>
+                <w:lang w:val="en-US"/>
+              </w:rPr>
+            </w:pPr>
+            <w:r>
+              <w:rPr>
+                <w:lang w:val="en-US"/>
+              </w:rPr>
+              <w:t>2023 Census totals by topic for individuals by statistical area 2 – part 2</w:t>
+            </w:r>
+          </w:p>
+          <w:p>
+            <w:pPr>
+              <w:rPr>
+                <w:lang w:val="en-US"/>
+              </w:rPr>
+            </w:pPr>
+          </w:p>
+          <w:p>
+            <w:hyperlink r:id="rId7" w:history="1">
+              <w:r>
+                <w:rPr>
+                  <w:rStyle w:val="Hyperlink"/>
+                </w:rPr>
+                <w:t>https://datafinder.stats.govt.nz/layer/120898-2023-census-totals-by-topic-for-individuals-by-statistical-area-2-part-2/attachments/25549/</w:t>
+              </w:r>
+            </w:hyperlink>
+          </w:p>
+        </w:tc>
+      </w:tr>
+      <w:tr>
+        <w:tc>
+          <w:tcPr>
+            <w:tcW w:w="2144" w:type="dxa"/>
+            <w:shd w:val="clear" w:color="auto" w:fill="C1E4F5" w:themeFill="accent1" w:themeFillTint="33"/>
+          </w:tcPr>
+          <w:p>
+            <w:r>
+              <w:t>Who collects it</w:t>
+            </w:r>
+          </w:p>
+        </w:tc>
+        <w:tc>
+          <w:tcPr>
+            <w:tcW w:w="6486" w:type="dxa"/>
+          </w:tcPr>
+          <w:p>
+            <w:r>
+              <w:t>STATS NZ</w:t>
+            </w:r>
+          </w:p>
+        </w:tc>
+      </w:tr>
+      <w:tr>
+        <w:trPr>
+          <w:gridAfter w:val="1"/>
+          <w:wAfter w:w="6486" w:type="dxa"/>
+        </w:trPr>
+        <w:tc>
+          <w:tcPr>
+            <w:tcW w:w="2144" w:type="dxa"/>
+            <w:shd w:val="clear" w:color="auto" w:fill="C1E4F5" w:themeFill="accent1" w:themeFillTint="33"/>
+          </w:tcPr>
+          <w:p>
+            <w:r>
+              <w:t>How it is collected</w:t>
+            </w:r>
+          </w:p>
+        </w:tc>
+      </w:tr>
+      <w:tr>
+        <w:tc>
+          <w:tcPr>
+            <w:tcW w:w="2144" w:type="dxa"/>
+            <w:shd w:val="clear" w:color="auto" w:fill="C1E4F5" w:themeFill="accent1" w:themeFillTint="33"/>
+          </w:tcPr>
+          <w:p>
+            <w:r>
+              <w:t>Purpose of collection</w:t>
+            </w:r>
+          </w:p>
+        </w:tc>
+        <w:tc>
+          <w:tcPr>
+            <w:tcW w:w="6486" w:type="dxa"/>
+          </w:tcPr>
+          <w:p/>
+        </w:tc>
+      </w:tr>
+      <w:tr>
+        <w:tc>
+          <w:tcPr>
+            <w:tcW w:w="2144" w:type="dxa"/>
+            <w:shd w:val="clear" w:color="auto" w:fill="C1E4F5" w:themeFill="accent1" w:themeFillTint="33"/>
+          </w:tcPr>
+          <w:p>
+            <w:r>
+              <w:t xml:space="preserve">Structure </w:t>
+            </w:r>
+          </w:p>
+          <w:p/>
+        </w:tc>
+        <w:tc>
+          <w:tcPr>
+            <w:tcW w:w="6486" w:type="dxa"/>
+          </w:tcPr>
+          <w:p>
+            <w:pPr>
+              <w:pStyle w:val="ListParagraph"/>
+              <w:numPr>
+                <w:ilvl w:val="0"/>
+                <w:numId w:val="4"/>
+              </w:numPr>
+            </w:pPr>
+            <w:r>
+              <w:t>Individual home ownership</w:t>
+            </w:r>
+          </w:p>
+          <w:p>
+            <w:pPr>
+              <w:pStyle w:val="ListParagraph"/>
+              <w:numPr>
+                <w:ilvl w:val="0"/>
+                <w:numId w:val="4"/>
+              </w:numPr>
+            </w:pPr>
+            <w:r>
+              <w:t>Usual residence 1 / 5 years ago indicators</w:t>
+            </w:r>
+          </w:p>
+          <w:p>
+            <w:pPr>
+              <w:pStyle w:val="ListParagraph"/>
+              <w:numPr>
+                <w:ilvl w:val="0"/>
+                <w:numId w:val="4"/>
+              </w:numPr>
+            </w:pPr>
+            <w:r>
+              <w:t>Years at usual residence (+ average)</w:t>
+            </w:r>
+          </w:p>
+          <w:p>
+            <w:pPr>
+              <w:pStyle w:val="ListParagraph"/>
+              <w:numPr>
+                <w:ilvl w:val="0"/>
+                <w:numId w:val="4"/>
+              </w:numPr>
+            </w:pPr>
+            <w:r>
+              <w:lastRenderedPageBreak/>
+              <w:t>Years since arrival in NZ for overseas-born residents (+ average)</w:t>
+            </w:r>
+          </w:p>
+          <w:p>
+            <w:pPr>
+              <w:pStyle w:val="ListParagraph"/>
+              <w:numPr>
+                <w:ilvl w:val="0"/>
+                <w:numId w:val="4"/>
+              </w:numPr>
+            </w:pPr>
+            <w:r>
+              <w:t>Study participation</w:t>
+            </w:r>
+          </w:p>
+          <w:p>
+            <w:pPr>
+              <w:pStyle w:val="ListParagraph"/>
+              <w:numPr>
+                <w:ilvl w:val="0"/>
+                <w:numId w:val="4"/>
+              </w:numPr>
+            </w:pPr>
+            <w:r>
+              <w:t xml:space="preserve">Main means of travel to education (by usual residence </w:t>
+            </w:r>
+            <w:r>
+              <w:rPr>
+                <w:i/>
+                <w:iCs/>
+              </w:rPr>
+              <w:t>and</w:t>
+            </w:r>
+            <w:r>
+              <w:t xml:space="preserve"> by education address)</w:t>
+            </w:r>
+          </w:p>
+          <w:p>
+            <w:pPr>
+              <w:pStyle w:val="ListParagraph"/>
+              <w:numPr>
+                <w:ilvl w:val="0"/>
+                <w:numId w:val="4"/>
+              </w:numPr>
+            </w:pPr>
+            <w:r>
+              <w:t>Highest qualification, post-school qualification indicator, highest secondary qualification, post-school attainment level</w:t>
+            </w:r>
+          </w:p>
+          <w:p>
+            <w:pPr>
+              <w:pStyle w:val="ListParagraph"/>
+              <w:numPr>
+                <w:ilvl w:val="0"/>
+                <w:numId w:val="4"/>
+              </w:numPr>
+            </w:pPr>
+            <w:r>
+              <w:t>Sources of personal income (total responses), total personal income, median personal income</w:t>
+            </w:r>
+          </w:p>
+          <w:p>
+            <w:pPr>
+              <w:pStyle w:val="ListParagraph"/>
+              <w:numPr>
+                <w:ilvl w:val="0"/>
+                <w:numId w:val="4"/>
+              </w:numPr>
+            </w:pPr>
+            <w:r>
+              <w:t xml:space="preserve">Work and </w:t>
+            </w:r>
+            <w:proofErr w:type="spellStart"/>
+            <w:r>
+              <w:t>labour</w:t>
+            </w:r>
+            <w:proofErr w:type="spellEnd"/>
+            <w:r>
+              <w:t xml:space="preserve"> force status</w:t>
+            </w:r>
+          </w:p>
+          <w:p>
+            <w:pPr>
+              <w:pStyle w:val="ListParagraph"/>
+              <w:numPr>
+                <w:ilvl w:val="0"/>
+                <w:numId w:val="4"/>
+              </w:numPr>
+            </w:pPr>
+            <w:r>
+              <w:t>Job search methods (unemployed only)</w:t>
+            </w:r>
+          </w:p>
+          <w:p>
+            <w:pPr>
+              <w:pStyle w:val="ListParagraph"/>
+              <w:numPr>
+                <w:ilvl w:val="0"/>
+                <w:numId w:val="4"/>
+              </w:numPr>
+            </w:pPr>
+            <w:r>
+              <w:t>Status in employment</w:t>
+            </w:r>
+          </w:p>
+          <w:p>
+            <w:pPr>
+              <w:pStyle w:val="ListParagraph"/>
+              <w:numPr>
+                <w:ilvl w:val="0"/>
+                <w:numId w:val="4"/>
+              </w:numPr>
+            </w:pPr>
+            <w:r>
+              <w:t>Unpaid activities (total responses)</w:t>
+            </w:r>
+          </w:p>
+          <w:p>
+            <w:pPr>
+              <w:pStyle w:val="ListParagraph"/>
+              <w:numPr>
+                <w:ilvl w:val="0"/>
+                <w:numId w:val="4"/>
+              </w:numPr>
+            </w:pPr>
+            <w:r>
+              <w:t>Hours worked per week (+ average)</w:t>
+            </w:r>
+          </w:p>
+          <w:p>
+            <w:pPr>
+              <w:pStyle w:val="ListParagraph"/>
+              <w:numPr>
+                <w:ilvl w:val="0"/>
+                <w:numId w:val="4"/>
+              </w:numPr>
+            </w:pPr>
+            <w:r>
+              <w:t xml:space="preserve">Industry (by usual residence </w:t>
+            </w:r>
+            <w:r>
+              <w:rPr>
+                <w:i/>
+                <w:iCs/>
+              </w:rPr>
+              <w:t>and</w:t>
+            </w:r>
+            <w:r>
+              <w:t xml:space="preserve"> by workplace address)</w:t>
+            </w:r>
+          </w:p>
+          <w:p>
+            <w:pPr>
+              <w:pStyle w:val="ListParagraph"/>
+              <w:numPr>
+                <w:ilvl w:val="0"/>
+                <w:numId w:val="4"/>
+              </w:numPr>
+            </w:pPr>
+            <w:r>
+              <w:t xml:space="preserve">Occupation (by usual residence </w:t>
+            </w:r>
+            <w:r>
+              <w:rPr>
+                <w:i/>
+                <w:iCs/>
+              </w:rPr>
+              <w:t>and</w:t>
+            </w:r>
+            <w:r>
+              <w:t xml:space="preserve"> by workplace address)</w:t>
+            </w:r>
+          </w:p>
+          <w:p>
+            <w:pPr>
+              <w:pStyle w:val="ListParagraph"/>
+              <w:numPr>
+                <w:ilvl w:val="0"/>
+                <w:numId w:val="4"/>
+              </w:numPr>
+            </w:pPr>
+            <w:r>
+              <w:rPr>
+                <w:b/>
+                <w:bCs/>
+              </w:rPr>
+              <w:t>Main means of travel to work</w:t>
+            </w:r>
+            <w:r>
+              <w:t xml:space="preserve"> (by usual residence </w:t>
+            </w:r>
+            <w:r>
+              <w:rPr>
+                <w:i/>
+                <w:iCs/>
+              </w:rPr>
+              <w:t>and</w:t>
+            </w:r>
+            <w:r>
+              <w:t xml:space="preserve"> by workplace address) </w:t>
+            </w:r>
+          </w:p>
+          <w:p>
+            <w:pPr>
+              <w:pStyle w:val="ListParagraph"/>
+              <w:numPr>
+                <w:ilvl w:val="0"/>
+                <w:numId w:val="4"/>
+              </w:numPr>
+            </w:pPr>
+            <w:r>
+              <w:t>Sector of ownership</w:t>
+            </w:r>
+          </w:p>
+          <w:p>
+            <w:pPr>
+              <w:pStyle w:val="ListParagraph"/>
+              <w:numPr>
+                <w:ilvl w:val="0"/>
+                <w:numId w:val="4"/>
+              </w:numPr>
+            </w:pPr>
+            <w:r>
+              <w:t>Individual unit data source</w:t>
+            </w:r>
+          </w:p>
+          <w:p>
+            <w:pPr>
+              <w:rPr>
+                <w:lang w:val="en-US"/>
+              </w:rPr>
+            </w:pPr>
+          </w:p>
+        </w:tc>
+      </w:tr>
+    </w:tbl>
+    <w:p>
+      <w:pPr>
+        <w:rPr>
+          <w:lang w:val="en-US" w:eastAsia="ja-JP"/>
+        </w:rPr>
+      </w:pPr>
+    </w:p>
+    <w:p>
+      <w:pPr>
+        <w:rPr>
+          <w:lang w:val="en-US" w:eastAsia="ja-JP"/>
+        </w:rPr>
+      </w:pPr>
+    </w:p>
+    <w:p>
+      <w:pPr>
+        <w:rPr>
+          <w:lang w:val="en-US" w:eastAsia="ja-JP"/>
+        </w:rPr>
+      </w:pPr>
+    </w:p>
+    <w:p>
+      <w:pPr>
+        <w:pStyle w:val="Heading1"/>
+      </w:pPr>
+      <w:r>
+        <w:lastRenderedPageBreak/>
+        <w:t>Visualizations</w:t>
+      </w:r>
+    </w:p>
+    <w:p>
+      <w:pPr>
+        <w:rPr>
+          <w:lang w:val="en-US" w:eastAsia="ja-JP"/>
+        </w:rPr>
+      </w:pPr>
+      <w:r>
+        <w:rPr>
+          <w:lang w:val="en-US" w:eastAsia="ja-JP"/>
+        </w:rPr>
+        <w:drawing>
+          <wp:inline distT="0" distB="0" distL="0" distR="0" wp14:anchorId="656201B8" wp14:editId="3E9B06ED">
+            <wp:extent cx="5943600" cy="3710305"/>
+            <wp:effectExtent l="0" t="0" r="0" b="4445"/>
+            <wp:docPr id="1076952173" name="Picture 1"/>
+            <wp:cNvGraphicFramePr>
+              <a:graphicFrameLocks xmlns:a="http://schemas.openxmlformats.org/drawingml/2006/main" noChangeAspect="1"/>
+            </wp:cNvGraphicFramePr>
+            <a:graphic xmlns:a="http://schemas.openxmlformats.org/drawingml/2006/main">
+              <a:graphicData uri="http://schemas.openxmlformats.org/drawingml/2006/picture">
+                <pic:pic xmlns:pic="http://schemas.openxmlformats.org/drawingml/2006/picture">
+                  <pic:nvPicPr>
+                    <pic:cNvPr id="1076952173" name=""/>
+                    <pic:cNvPicPr/>
+                  </pic:nvPicPr>
+                  <pic:blipFill>
+                    <a:blip r:embed="rId8"/>
+                    <a:stretch>
+                      <a:fillRect/>
+                    </a:stretch>
+                  </pic:blipFill>
+                  <pic:spPr>
+                    <a:xfrm>
+                      <a:off x="0" y="0"/>
+                      <a:ext cx="5943600" cy="3710305"/>
+                    </a:xfrm>
+                    <a:prstGeom prst="rect">
+                      <a:avLst/>
+                    </a:prstGeom>
+                  </pic:spPr>
+                </pic:pic>
+              </a:graphicData>
+            </a:graphic>
+          </wp:inline>
+        </w:drawing>
+      </w:r>
+    </w:p>
+    <w:p>
+      <w:pPr>
+        <w:rPr>
+          <w:lang w:val="en-US" w:eastAsia="ja-JP"/>
+        </w:rPr>
+      </w:pPr>
+    </w:p>
+    <w:p>
+      <w:pPr>
+        <w:rPr>
+          <w:lang w:val="en-US" w:eastAsia="ja-JP"/>
+        </w:rPr>
+      </w:pPr>
+    </w:p>
+    <w:p>
+      <w:pPr>
+        <w:rPr>
+          <w:lang w:val="en-US" w:eastAsia="ja-JP"/>
+        </w:rPr>
+      </w:pPr>
+    </w:p>
+    <w:p>
+      <w:pPr>
+        <w:rPr>
+          <w:lang w:val="en-US" w:eastAsia="ja-JP"/>
+        </w:rPr>
+      </w:pPr>
+      <w:r>
+        <w:rPr>
+          <w:lang w:val="en-US" w:eastAsia="ja-JP"/>
+        </w:rPr>
+        <w:drawing>
+          <wp:inline distT="0" distB="0" distL="0" distR="0" wp14:anchorId="38496F7A" wp14:editId="28918C75">
+            <wp:extent cx="4792133" cy="2872208"/>
+            <wp:effectExtent l="0" t="0" r="8890" b="4445"/>
+            <wp:docPr id="1197281898" name="Picture 1"/>
+            <wp:cNvGraphicFramePr>
+              <a:graphicFrameLocks xmlns:a="http://schemas.openxmlformats.org/drawingml/2006/main" noChangeAspect="1"/>
+            </wp:cNvGraphicFramePr>
+            <a:graphic xmlns:a="http://schemas.openxmlformats.org/drawingml/2006/main">
+              <a:graphicData uri="http://schemas.openxmlformats.org/drawingml/2006/picture">
+                <pic:pic xmlns:pic="http://schemas.openxmlformats.org/drawingml/2006/picture">
+                  <pic:nvPicPr>
+                    <pic:cNvPr id="1197281898" name=""/>
+                    <pic:cNvPicPr/>
+                  </pic:nvPicPr>
+                  <pic:blipFill>
+                    <a:blip r:embed="rId9"/>
+                    <a:stretch>
+                      <a:fillRect/>
+                    </a:stretch>
+                  </pic:blipFill>
+                  <pic:spPr>
+                    <a:xfrm>
+                      <a:off x="0" y="0"/>
+                      <a:ext cx="4795177" cy="2874033"/>
+                    </a:xfrm>
+                    <a:prstGeom prst="rect">
+                      <a:avLst/>
+                    </a:prstGeom>
+                  </pic:spPr>
+                </pic:pic>
+              </a:graphicData>
+            </a:graphic>
+          </wp:inline>
+        </w:drawing>
+      </w:r>
+    </w:p>
+    <w:p>
+      <w:pPr>
+        <w:rPr>
+          <w:lang w:val="en-US" w:eastAsia="ja-JP"/>
+        </w:rPr>
+      </w:pPr>
+      <w:r>
+        <w:rPr>
+          <w:lang w:val="en-US" w:eastAsia="ja-JP"/>
+        </w:rPr>
+        <w:lastRenderedPageBreak/>
+        <w:t xml:space="preserve">Create centroids for each </w:t>
+      </w:r>
+      <w:proofErr w:type="gramStart"/>
+      <w:r>
+        <w:rPr>
+          <w:lang w:val="en-US" w:eastAsia="ja-JP"/>
+        </w:rPr>
+        <w:t>sa2, and</w:t>
+      </w:r>
+      <w:proofErr w:type="gramEnd"/>
+      <w:r>
+        <w:rPr>
+          <w:lang w:val="en-US" w:eastAsia="ja-JP"/>
+        </w:rPr>
+        <w:t xml:space="preserve"> calculate the distance to </w:t>
+      </w:r>
+      <w:proofErr w:type="spellStart"/>
+      <w:r>
+        <w:rPr>
+          <w:lang w:val="en-US" w:eastAsia="ja-JP"/>
+        </w:rPr>
+        <w:t>cbd</w:t>
+      </w:r>
+      <w:proofErr w:type="spellEnd"/>
+      <w:r>
+        <w:rPr>
+          <w:lang w:val="en-US" w:eastAsia="ja-JP"/>
+        </w:rPr>
+        <w:t xml:space="preserve">. </w:t>
+      </w:r>
+    </w:p>
+    <w:p>
+      <w:pPr>
+        <w:rPr>
+          <w:lang w:val="en-US" w:eastAsia="ja-JP"/>
+        </w:rPr>
+      </w:pPr>
+    </w:p>
+    <w:p>
+      <w:pPr>
+        <w:rPr>
+          <w:lang w:val="en-US" w:eastAsia="ja-JP"/>
+        </w:rPr>
+      </w:pPr>
+    </w:p>
+    <w:p>
+      <w:pPr>
+        <w:rPr>
+          <w:lang w:val="en-US" w:eastAsia="ja-JP"/>
+        </w:rPr>
+      </w:pPr>
+    </w:p>
+    <w:p>
+      <w:pPr>
+        <w:rPr>
+          <w:lang w:val="en-US" w:eastAsia="ja-JP"/>
+        </w:rPr>
+      </w:pPr>
+      <w:r>
+        <w:rPr>
+          <w:lang w:val="en-US" w:eastAsia="ja-JP"/>
+        </w:rPr>
+        <w:t xml:space="preserve">Since there were higher proportions of congested weekday travel trips in </w:t>
+      </w:r>
+      <w:proofErr w:type="gramStart"/>
+      <w:r>
+        <w:rPr>
+          <w:lang w:val="en-US" w:eastAsia="ja-JP"/>
+        </w:rPr>
+        <w:t>the  travel</w:t>
+      </w:r>
+      <w:proofErr w:type="gramEnd"/>
+      <w:r>
+        <w:rPr>
+          <w:lang w:val="en-US" w:eastAsia="ja-JP"/>
+        </w:rPr>
+        <w:t xml:space="preserve"> to/from work category observed, I have focused on this specific category for my data analysis as </w:t>
+      </w:r>
+      <w:proofErr w:type="gramStart"/>
+      <w:r>
+        <w:rPr>
+          <w:lang w:val="en-US" w:eastAsia="ja-JP"/>
+        </w:rPr>
+        <w:t>well(</w:t>
+      </w:r>
+      <w:proofErr w:type="gramEnd"/>
+      <w:r>
+        <w:rPr>
+          <w:lang w:val="en-US" w:eastAsia="ja-JP"/>
+        </w:rPr>
+        <w:t>this is sourced from online)</w:t>
+      </w:r>
+    </w:p>
+    <w:p>
+      <w:pPr>
+        <w:keepNext/>
+      </w:pPr>
+      <w:r>
+        <w:rPr>
+          <w:lang w:val="en-US" w:eastAsia="ja-JP"/>
+        </w:rPr>
+        <w:drawing>
+          <wp:inline distT="0" distB="0" distL="0" distR="0" wp14:anchorId="57FB1885" wp14:editId="60D66E49">
+            <wp:extent cx="5943600" cy="3098165"/>
+            <wp:effectExtent l="0" t="0" r="0" b="6985"/>
+            <wp:docPr id="1497547604" name="Picture 1"/>
+            <wp:cNvGraphicFramePr>
+              <a:graphicFrameLocks xmlns:a="http://schemas.openxmlformats.org/drawingml/2006/main" noChangeAspect="1"/>
+            </wp:cNvGraphicFramePr>
+            <a:graphic xmlns:a="http://schemas.openxmlformats.org/drawingml/2006/main">
+              <a:graphicData uri="http://schemas.openxmlformats.org/drawingml/2006/picture">
+                <pic:pic xmlns:pic="http://schemas.openxmlformats.org/drawingml/2006/picture">
+                  <pic:nvPicPr>
+                    <pic:cNvPr id="1497547604" name=""/>
+                    <pic:cNvPicPr/>
+                  </pic:nvPicPr>
+                  <pic:blipFill>
+                    <a:blip r:embed="rId10"/>
+                    <a:stretch>
+                      <a:fillRect/>
+                    </a:stretch>
+                  </pic:blipFill>
+                  <pic:spPr>
+                    <a:xfrm>
+                      <a:off x="0" y="0"/>
+                      <a:ext cx="5943600" cy="3098165"/>
+                    </a:xfrm>
+                    <a:prstGeom prst="rect">
+                      <a:avLst/>
+                    </a:prstGeom>
+                  </pic:spPr>
+                </pic:pic>
+              </a:graphicData>
+            </a:graphic>
+          </wp:inline>
+        </w:drawing>
+      </w:r>
+    </w:p>
+    <w:p>
+      <w:pPr>
+        <w:pStyle w:val="Caption"/>
+        <w:rPr>
+          <w:lang w:val="en-US" w:eastAsia="ja-JP"/>
+        </w:rPr>
+      </w:pPr>
+      <w:r>
+        <w:t xml:space="preserve">Figure </w:t>
+      </w:r>
+      <w:r>
+        <w:fldChar w:fldCharType="begin"/>
+      </w:r>
+      <w:r>
+        <w:instrText xml:space="preserve"> SEQ Figure \* ARABIC </w:instrText>
+      </w:r>
+      <w:r>
+        <w:fldChar w:fldCharType="separate"/>
+      </w:r>
+      <w:r>
+        <w:rPr>
+          <w:noProof/>
+        </w:rPr>
+        <w:t>1</w:t>
+      </w:r>
+      <w:r>
+        <w:fldChar w:fldCharType="end"/>
+      </w:r>
+      <w:r>
+        <w:t xml:space="preserve">Sourced from the </w:t>
+      </w:r>
+      <w:hyperlink r:id="rId11" w:history="1">
+        <w:proofErr w:type="spellStart"/>
+        <w:proofErr w:type="gramStart"/>
+        <w:r>
+          <w:rPr>
+            <w:rStyle w:val="Hyperlink"/>
+          </w:rPr>
+          <w:t>conegstion</w:t>
+        </w:r>
+        <w:proofErr w:type="spellEnd"/>
+        <w:r>
+          <w:rPr>
+            <w:rStyle w:val="Hyperlink"/>
+          </w:rPr>
+          <w:t xml:space="preserve">  report</w:t>
+        </w:r>
+        <w:proofErr w:type="gramEnd"/>
+      </w:hyperlink>
+      <w:r>
+        <w:t xml:space="preserve"> </w:t>
+      </w:r>
+    </w:p>
+    <w:p>
+      <w:pPr>
+        <w:rPr>
+          <w:lang w:val="en-US" w:eastAsia="ja-JP"/>
+        </w:rPr>
       </w:pPr>
     </w:p>
     <w:sectPr>
@@ -213,6 +2522,472 @@
     </w:sectPr>
   </w:body>
 </w:document>
+</file>
+
+<file path=word/numbering.xml><?xml version="1.0" encoding="utf-8"?>
+<w:numbering xmlns:wpc="http://schemas.microsoft.com/office/word/2010/wordprocessingCanvas" xmlns:cx="http://schemas.microsoft.com/office/drawing/2014/chartex" xmlns:cx1="http://schemas.microsoft.com/office/drawing/2015/9/8/chartex" xmlns:cx2="http://schemas.microsoft.com/office/drawing/2015/10/21/chartex" xmlns:cx3="http://schemas.microsoft.com/office/drawing/2016/5/9/chartex" xmlns:cx4="http://schemas.microsoft.com/office/drawing/2016/5/10/chartex" xmlns:cx5="http://schemas.microsoft.com/office/drawing/2016/5/11/chartex" xmlns:cx6="http://schemas.microsoft.com/office/drawing/2016/5/12/chartex" xmlns:cx7="http://schemas.microsoft.com/office/drawing/2016/5/13/chartex" xmlns:cx8="http://schemas.microsoft.com/office/drawing/2016/5/14/chartex" xmlns:mc="http://schemas.openxmlformats.org/markup-compatibility/2006" xmlns:aink="http://schemas.microsoft.com/office/drawing/2016/ink" xmlns:am3d="http://schemas.microsoft.com/office/drawing/2017/model3d" xmlns:o="urn:schemas-microsoft-com:office:office" xmlns:oel="http://schemas.microsoft.com/office/2019/extlst" xmlns:r="http://schemas.openxmlformats.org/officeDocument/2006/relationships" xmlns:m="http://schemas.openxmlformats.org/officeDocument/2006/math" xmlns:v="urn:schemas-microsoft-com:vml" xmlns:wp14="http://schemas.microsoft.com/office/word/2010/wordprocessingDrawing" xmlns:wp="http://schemas.openxmlformats.org/drawingml/2006/wordprocessingDrawing" xmlns:w10="urn:schemas-microsoft-com:office:word" xmlns:w="http://schemas.openxmlformats.org/wordprocessingml/2006/main" xmlns:w14="http://schemas.microsoft.com/office/word/2010/wordml" xmlns:w15="http://schemas.microsoft.com/office/word/2012/wordml" xmlns:w16cex="http://schemas.microsoft.com/office/word/2018/wordml/cex" xmlns:w16cid="http://schemas.microsoft.com/office/word/2016/wordml/cid" xmlns:w16="http://schemas.microsoft.com/office/word/2018/wordml" xmlns:w16du="http://schemas.microsoft.com/office/word/2023/wordml/word16du" xmlns:w16sdtdh="http://schemas.microsoft.com/office/word/2020/wordml/sdtdatahash" xmlns:w16sdtfl="http://schemas.microsoft.com/office/word/2024/wordml/sdtformatlock" xmlns:w16se="http://schemas.microsoft.com/office/word/2015/wordml/symex" xmlns:wpg="http://schemas.microsoft.com/office/word/2010/wordprocessingGroup" xmlns:wpi="http://schemas.microsoft.com/office/word/2010/wordprocessingInk" xmlns:wne="http://schemas.microsoft.com/office/word/2006/wordml" xmlns:wps="http://schemas.microsoft.com/office/word/2010/wordprocessingShape" mc:Ignorable="w14 w15 w16se w16cid w16 w16cex w16sdtdh w16sdtfl w16du wp14">
+  <w:abstractNum w:abstractNumId="0" w15:restartNumberingAfterBreak="0">
+    <w:nsid w:val="022A2F92"/>
+    <w:multiLevelType w:val="hybridMultilevel"/>
+    <w:tmpl w:val="AEDCC5FC"/>
+    <w:lvl w:ilvl="0" w:tplc="A1A263EC">
+      <w:numFmt w:val="bullet"/>
+      <w:lvlText w:val="-"/>
+      <w:lvlJc w:val="left"/>
+      <w:pPr>
+        <w:ind w:left="720" w:hanging="360"/>
+      </w:pPr>
+      <w:rPr>
+        <w:rFonts w:ascii="Aptos" w:eastAsiaTheme="minorEastAsia" w:hAnsi="Aptos" w:cstheme="minorBidi" w:hint="default"/>
+      </w:rPr>
+    </w:lvl>
+    <w:lvl w:ilvl="1" w:tplc="04090003" w:tentative="1">
+      <w:start w:val="1"/>
+      <w:numFmt w:val="bullet"/>
+      <w:lvlText w:val="o"/>
+      <w:lvlJc w:val="left"/>
+      <w:pPr>
+        <w:ind w:left="1440" w:hanging="360"/>
+      </w:pPr>
+      <w:rPr>
+        <w:rFonts w:ascii="Courier New" w:hAnsi="Courier New" w:cs="Courier New" w:hint="default"/>
+      </w:rPr>
+    </w:lvl>
+    <w:lvl w:ilvl="2" w:tplc="04090005" w:tentative="1">
+      <w:start w:val="1"/>
+      <w:numFmt w:val="bullet"/>
+      <w:lvlText w:val=""/>
+      <w:lvlJc w:val="left"/>
+      <w:pPr>
+        <w:ind w:left="2160" w:hanging="360"/>
+      </w:pPr>
+      <w:rPr>
+        <w:rFonts w:ascii="Wingdings" w:hAnsi="Wingdings" w:hint="default"/>
+      </w:rPr>
+    </w:lvl>
+    <w:lvl w:ilvl="3" w:tplc="04090001" w:tentative="1">
+      <w:start w:val="1"/>
+      <w:numFmt w:val="bullet"/>
+      <w:lvlText w:val=""/>
+      <w:lvlJc w:val="left"/>
+      <w:pPr>
+        <w:ind w:left="2880" w:hanging="360"/>
+      </w:pPr>
+      <w:rPr>
+        <w:rFonts w:ascii="Symbol" w:hAnsi="Symbol" w:hint="default"/>
+      </w:rPr>
+    </w:lvl>
+    <w:lvl w:ilvl="4" w:tplc="04090003" w:tentative="1">
+      <w:start w:val="1"/>
+      <w:numFmt w:val="bullet"/>
+      <w:lvlText w:val="o"/>
+      <w:lvlJc w:val="left"/>
+      <w:pPr>
+        <w:ind w:left="3600" w:hanging="360"/>
+      </w:pPr>
+      <w:rPr>
+        <w:rFonts w:ascii="Courier New" w:hAnsi="Courier New" w:cs="Courier New" w:hint="default"/>
+      </w:rPr>
+    </w:lvl>
+    <w:lvl w:ilvl="5" w:tplc="04090005" w:tentative="1">
+      <w:start w:val="1"/>
+      <w:numFmt w:val="bullet"/>
+      <w:lvlText w:val=""/>
+      <w:lvlJc w:val="left"/>
+      <w:pPr>
+        <w:ind w:left="4320" w:hanging="360"/>
+      </w:pPr>
+      <w:rPr>
+        <w:rFonts w:ascii="Wingdings" w:hAnsi="Wingdings" w:hint="default"/>
+      </w:rPr>
+    </w:lvl>
+    <w:lvl w:ilvl="6" w:tplc="04090001" w:tentative="1">
+      <w:start w:val="1"/>
+      <w:numFmt w:val="bullet"/>
+      <w:lvlText w:val=""/>
+      <w:lvlJc w:val="left"/>
+      <w:pPr>
+        <w:ind w:left="5040" w:hanging="360"/>
+      </w:pPr>
+      <w:rPr>
+        <w:rFonts w:ascii="Symbol" w:hAnsi="Symbol" w:hint="default"/>
+      </w:rPr>
+    </w:lvl>
+    <w:lvl w:ilvl="7" w:tplc="04090003" w:tentative="1">
+      <w:start w:val="1"/>
+      <w:numFmt w:val="bullet"/>
+      <w:lvlText w:val="o"/>
+      <w:lvlJc w:val="left"/>
+      <w:pPr>
+        <w:ind w:left="5760" w:hanging="360"/>
+      </w:pPr>
+      <w:rPr>
+        <w:rFonts w:ascii="Courier New" w:hAnsi="Courier New" w:cs="Courier New" w:hint="default"/>
+      </w:rPr>
+    </w:lvl>
+    <w:lvl w:ilvl="8" w:tplc="04090005" w:tentative="1">
+      <w:start w:val="1"/>
+      <w:numFmt w:val="bullet"/>
+      <w:lvlText w:val=""/>
+      <w:lvlJc w:val="left"/>
+      <w:pPr>
+        <w:ind w:left="6480" w:hanging="360"/>
+      </w:pPr>
+      <w:rPr>
+        <w:rFonts w:ascii="Wingdings" w:hAnsi="Wingdings" w:hint="default"/>
+      </w:rPr>
+    </w:lvl>
+  </w:abstractNum>
+  <w:abstractNum w:abstractNumId="1" w15:restartNumberingAfterBreak="0">
+    <w:nsid w:val="47247B82"/>
+    <w:multiLevelType w:val="hybridMultilevel"/>
+    <w:tmpl w:val="EE8293AC"/>
+    <w:lvl w:ilvl="0" w:tplc="A1A263EC">
+      <w:numFmt w:val="bullet"/>
+      <w:lvlText w:val="-"/>
+      <w:lvlJc w:val="left"/>
+      <w:pPr>
+        <w:ind w:left="720" w:hanging="360"/>
+      </w:pPr>
+      <w:rPr>
+        <w:rFonts w:ascii="Aptos" w:eastAsiaTheme="minorEastAsia" w:hAnsi="Aptos" w:cstheme="minorBidi" w:hint="default"/>
+      </w:rPr>
+    </w:lvl>
+    <w:lvl w:ilvl="1" w:tplc="04090003" w:tentative="1">
+      <w:start w:val="1"/>
+      <w:numFmt w:val="bullet"/>
+      <w:lvlText w:val="o"/>
+      <w:lvlJc w:val="left"/>
+      <w:pPr>
+        <w:ind w:left="1440" w:hanging="360"/>
+      </w:pPr>
+      <w:rPr>
+        <w:rFonts w:ascii="Courier New" w:hAnsi="Courier New" w:cs="Courier New" w:hint="default"/>
+      </w:rPr>
+    </w:lvl>
+    <w:lvl w:ilvl="2" w:tplc="04090005" w:tentative="1">
+      <w:start w:val="1"/>
+      <w:numFmt w:val="bullet"/>
+      <w:lvlText w:val=""/>
+      <w:lvlJc w:val="left"/>
+      <w:pPr>
+        <w:ind w:left="2160" w:hanging="360"/>
+      </w:pPr>
+      <w:rPr>
+        <w:rFonts w:ascii="Wingdings" w:hAnsi="Wingdings" w:hint="default"/>
+      </w:rPr>
+    </w:lvl>
+    <w:lvl w:ilvl="3" w:tplc="04090001" w:tentative="1">
+      <w:start w:val="1"/>
+      <w:numFmt w:val="bullet"/>
+      <w:lvlText w:val=""/>
+      <w:lvlJc w:val="left"/>
+      <w:pPr>
+        <w:ind w:left="2880" w:hanging="360"/>
+      </w:pPr>
+      <w:rPr>
+        <w:rFonts w:ascii="Symbol" w:hAnsi="Symbol" w:hint="default"/>
+      </w:rPr>
+    </w:lvl>
+    <w:lvl w:ilvl="4" w:tplc="04090003" w:tentative="1">
+      <w:start w:val="1"/>
+      <w:numFmt w:val="bullet"/>
+      <w:lvlText w:val="o"/>
+      <w:lvlJc w:val="left"/>
+      <w:pPr>
+        <w:ind w:left="3600" w:hanging="360"/>
+      </w:pPr>
+      <w:rPr>
+        <w:rFonts w:ascii="Courier New" w:hAnsi="Courier New" w:cs="Courier New" w:hint="default"/>
+      </w:rPr>
+    </w:lvl>
+    <w:lvl w:ilvl="5" w:tplc="04090005" w:tentative="1">
+      <w:start w:val="1"/>
+      <w:numFmt w:val="bullet"/>
+      <w:lvlText w:val=""/>
+      <w:lvlJc w:val="left"/>
+      <w:pPr>
+        <w:ind w:left="4320" w:hanging="360"/>
+      </w:pPr>
+      <w:rPr>
+        <w:rFonts w:ascii="Wingdings" w:hAnsi="Wingdings" w:hint="default"/>
+      </w:rPr>
+    </w:lvl>
+    <w:lvl w:ilvl="6" w:tplc="04090001" w:tentative="1">
+      <w:start w:val="1"/>
+      <w:numFmt w:val="bullet"/>
+      <w:lvlText w:val=""/>
+      <w:lvlJc w:val="left"/>
+      <w:pPr>
+        <w:ind w:left="5040" w:hanging="360"/>
+      </w:pPr>
+      <w:rPr>
+        <w:rFonts w:ascii="Symbol" w:hAnsi="Symbol" w:hint="default"/>
+      </w:rPr>
+    </w:lvl>
+    <w:lvl w:ilvl="7" w:tplc="04090003" w:tentative="1">
+      <w:start w:val="1"/>
+      <w:numFmt w:val="bullet"/>
+      <w:lvlText w:val="o"/>
+      <w:lvlJc w:val="left"/>
+      <w:pPr>
+        <w:ind w:left="5760" w:hanging="360"/>
+      </w:pPr>
+      <w:rPr>
+        <w:rFonts w:ascii="Courier New" w:hAnsi="Courier New" w:cs="Courier New" w:hint="default"/>
+      </w:rPr>
+    </w:lvl>
+    <w:lvl w:ilvl="8" w:tplc="04090005" w:tentative="1">
+      <w:start w:val="1"/>
+      <w:numFmt w:val="bullet"/>
+      <w:lvlText w:val=""/>
+      <w:lvlJc w:val="left"/>
+      <w:pPr>
+        <w:ind w:left="6480" w:hanging="360"/>
+      </w:pPr>
+      <w:rPr>
+        <w:rFonts w:ascii="Wingdings" w:hAnsi="Wingdings" w:hint="default"/>
+      </w:rPr>
+    </w:lvl>
+  </w:abstractNum>
+  <w:abstractNum w:abstractNumId="2" w15:restartNumberingAfterBreak="0">
+    <w:nsid w:val="474A34E6"/>
+    <w:multiLevelType w:val="hybridMultilevel"/>
+    <w:tmpl w:val="B7C45086"/>
+    <w:lvl w:ilvl="0" w:tplc="0824BFC6">
+      <w:numFmt w:val="bullet"/>
+      <w:lvlText w:val=""/>
+      <w:lvlJc w:val="left"/>
+      <w:pPr>
+        <w:ind w:left="720" w:hanging="360"/>
+      </w:pPr>
+      <w:rPr>
+        <w:rFonts w:ascii="Aptos" w:eastAsiaTheme="minorEastAsia" w:hAnsi="Aptos" w:cstheme="minorBidi" w:hint="default"/>
+      </w:rPr>
+    </w:lvl>
+    <w:lvl w:ilvl="1" w:tplc="04090003" w:tentative="1">
+      <w:start w:val="1"/>
+      <w:numFmt w:val="bullet"/>
+      <w:lvlText w:val="o"/>
+      <w:lvlJc w:val="left"/>
+      <w:pPr>
+        <w:ind w:left="1440" w:hanging="360"/>
+      </w:pPr>
+      <w:rPr>
+        <w:rFonts w:ascii="Courier New" w:hAnsi="Courier New" w:cs="Courier New" w:hint="default"/>
+      </w:rPr>
+    </w:lvl>
+    <w:lvl w:ilvl="2" w:tplc="04090005" w:tentative="1">
+      <w:start w:val="1"/>
+      <w:numFmt w:val="bullet"/>
+      <w:lvlText w:val=""/>
+      <w:lvlJc w:val="left"/>
+      <w:pPr>
+        <w:ind w:left="2160" w:hanging="360"/>
+      </w:pPr>
+      <w:rPr>
+        <w:rFonts w:ascii="Wingdings" w:hAnsi="Wingdings" w:hint="default"/>
+      </w:rPr>
+    </w:lvl>
+    <w:lvl w:ilvl="3" w:tplc="04090001" w:tentative="1">
+      <w:start w:val="1"/>
+      <w:numFmt w:val="bullet"/>
+      <w:lvlText w:val=""/>
+      <w:lvlJc w:val="left"/>
+      <w:pPr>
+        <w:ind w:left="2880" w:hanging="360"/>
+      </w:pPr>
+      <w:rPr>
+        <w:rFonts w:ascii="Symbol" w:hAnsi="Symbol" w:hint="default"/>
+      </w:rPr>
+    </w:lvl>
+    <w:lvl w:ilvl="4" w:tplc="04090003" w:tentative="1">
+      <w:start w:val="1"/>
+      <w:numFmt w:val="bullet"/>
+      <w:lvlText w:val="o"/>
+      <w:lvlJc w:val="left"/>
+      <w:pPr>
+        <w:ind w:left="3600" w:hanging="360"/>
+      </w:pPr>
+      <w:rPr>
+        <w:rFonts w:ascii="Courier New" w:hAnsi="Courier New" w:cs="Courier New" w:hint="default"/>
+      </w:rPr>
+    </w:lvl>
+    <w:lvl w:ilvl="5" w:tplc="04090005" w:tentative="1">
+      <w:start w:val="1"/>
+      <w:numFmt w:val="bullet"/>
+      <w:lvlText w:val=""/>
+      <w:lvlJc w:val="left"/>
+      <w:pPr>
+        <w:ind w:left="4320" w:hanging="360"/>
+      </w:pPr>
+      <w:rPr>
+        <w:rFonts w:ascii="Wingdings" w:hAnsi="Wingdings" w:hint="default"/>
+      </w:rPr>
+    </w:lvl>
+    <w:lvl w:ilvl="6" w:tplc="04090001" w:tentative="1">
+      <w:start w:val="1"/>
+      <w:numFmt w:val="bullet"/>
+      <w:lvlText w:val=""/>
+      <w:lvlJc w:val="left"/>
+      <w:pPr>
+        <w:ind w:left="5040" w:hanging="360"/>
+      </w:pPr>
+      <w:rPr>
+        <w:rFonts w:ascii="Symbol" w:hAnsi="Symbol" w:hint="default"/>
+      </w:rPr>
+    </w:lvl>
+    <w:lvl w:ilvl="7" w:tplc="04090003" w:tentative="1">
+      <w:start w:val="1"/>
+      <w:numFmt w:val="bullet"/>
+      <w:lvlText w:val="o"/>
+      <w:lvlJc w:val="left"/>
+      <w:pPr>
+        <w:ind w:left="5760" w:hanging="360"/>
+      </w:pPr>
+      <w:rPr>
+        <w:rFonts w:ascii="Courier New" w:hAnsi="Courier New" w:cs="Courier New" w:hint="default"/>
+      </w:rPr>
+    </w:lvl>
+    <w:lvl w:ilvl="8" w:tplc="04090005" w:tentative="1">
+      <w:start w:val="1"/>
+      <w:numFmt w:val="bullet"/>
+      <w:lvlText w:val=""/>
+      <w:lvlJc w:val="left"/>
+      <w:pPr>
+        <w:ind w:left="6480" w:hanging="360"/>
+      </w:pPr>
+      <w:rPr>
+        <w:rFonts w:ascii="Wingdings" w:hAnsi="Wingdings" w:hint="default"/>
+      </w:rPr>
+    </w:lvl>
+  </w:abstractNum>
+  <w:abstractNum w:abstractNumId="3" w15:restartNumberingAfterBreak="0">
+    <w:nsid w:val="4DE221B9"/>
+    <w:multiLevelType w:val="hybridMultilevel"/>
+    <w:tmpl w:val="D990FBBC"/>
+    <w:lvl w:ilvl="0" w:tplc="04090001">
+      <w:start w:val="1"/>
+      <w:numFmt w:val="bullet"/>
+      <w:lvlText w:val=""/>
+      <w:lvlJc w:val="left"/>
+      <w:pPr>
+        <w:ind w:left="720" w:hanging="360"/>
+      </w:pPr>
+      <w:rPr>
+        <w:rFonts w:ascii="Symbol" w:hAnsi="Symbol" w:hint="default"/>
+      </w:rPr>
+    </w:lvl>
+    <w:lvl w:ilvl="1" w:tplc="04090003" w:tentative="1">
+      <w:start w:val="1"/>
+      <w:numFmt w:val="bullet"/>
+      <w:lvlText w:val="o"/>
+      <w:lvlJc w:val="left"/>
+      <w:pPr>
+        <w:ind w:left="1440" w:hanging="360"/>
+      </w:pPr>
+      <w:rPr>
+        <w:rFonts w:ascii="Courier New" w:hAnsi="Courier New" w:cs="Courier New" w:hint="default"/>
+      </w:rPr>
+    </w:lvl>
+    <w:lvl w:ilvl="2" w:tplc="04090005" w:tentative="1">
+      <w:start w:val="1"/>
+      <w:numFmt w:val="bullet"/>
+      <w:lvlText w:val=""/>
+      <w:lvlJc w:val="left"/>
+      <w:pPr>
+        <w:ind w:left="2160" w:hanging="360"/>
+      </w:pPr>
+      <w:rPr>
+        <w:rFonts w:ascii="Wingdings" w:hAnsi="Wingdings" w:hint="default"/>
+      </w:rPr>
+    </w:lvl>
+    <w:lvl w:ilvl="3" w:tplc="04090001" w:tentative="1">
+      <w:start w:val="1"/>
+      <w:numFmt w:val="bullet"/>
+      <w:lvlText w:val=""/>
+      <w:lvlJc w:val="left"/>
+      <w:pPr>
+        <w:ind w:left="2880" w:hanging="360"/>
+      </w:pPr>
+      <w:rPr>
+        <w:rFonts w:ascii="Symbol" w:hAnsi="Symbol" w:hint="default"/>
+      </w:rPr>
+    </w:lvl>
+    <w:lvl w:ilvl="4" w:tplc="04090003" w:tentative="1">
+      <w:start w:val="1"/>
+      <w:numFmt w:val="bullet"/>
+      <w:lvlText w:val="o"/>
+      <w:lvlJc w:val="left"/>
+      <w:pPr>
+        <w:ind w:left="3600" w:hanging="360"/>
+      </w:pPr>
+      <w:rPr>
+        <w:rFonts w:ascii="Courier New" w:hAnsi="Courier New" w:cs="Courier New" w:hint="default"/>
+      </w:rPr>
+    </w:lvl>
+    <w:lvl w:ilvl="5" w:tplc="04090005" w:tentative="1">
+      <w:start w:val="1"/>
+      <w:numFmt w:val="bullet"/>
+      <w:lvlText w:val=""/>
+      <w:lvlJc w:val="left"/>
+      <w:pPr>
+        <w:ind w:left="4320" w:hanging="360"/>
+      </w:pPr>
+      <w:rPr>
+        <w:rFonts w:ascii="Wingdings" w:hAnsi="Wingdings" w:hint="default"/>
+      </w:rPr>
+    </w:lvl>
+    <w:lvl w:ilvl="6" w:tplc="04090001" w:tentative="1">
+      <w:start w:val="1"/>
+      <w:numFmt w:val="bullet"/>
+      <w:lvlText w:val=""/>
+      <w:lvlJc w:val="left"/>
+      <w:pPr>
+        <w:ind w:left="5040" w:hanging="360"/>
+      </w:pPr>
+      <w:rPr>
+        <w:rFonts w:ascii="Symbol" w:hAnsi="Symbol" w:hint="default"/>
+      </w:rPr>
+    </w:lvl>
+    <w:lvl w:ilvl="7" w:tplc="04090003" w:tentative="1">
+      <w:start w:val="1"/>
+      <w:numFmt w:val="bullet"/>
+      <w:lvlText w:val="o"/>
+      <w:lvlJc w:val="left"/>
+      <w:pPr>
+        <w:ind w:left="5760" w:hanging="360"/>
+      </w:pPr>
+      <w:rPr>
+        <w:rFonts w:ascii="Courier New" w:hAnsi="Courier New" w:cs="Courier New" w:hint="default"/>
+      </w:rPr>
+    </w:lvl>
+    <w:lvl w:ilvl="8" w:tplc="04090005" w:tentative="1">
+      <w:start w:val="1"/>
+      <w:numFmt w:val="bullet"/>
+      <w:lvlText w:val=""/>
+      <w:lvlJc w:val="left"/>
+      <w:pPr>
+        <w:ind w:left="6480" w:hanging="360"/>
+      </w:pPr>
+      <w:rPr>
+        <w:rFonts w:ascii="Wingdings" w:hAnsi="Wingdings" w:hint="default"/>
+      </w:rPr>
+    </w:lvl>
+  </w:abstractNum>
+  <w:num w:numId="1" w16cid:durableId="277687570">
+    <w:abstractNumId w:val="0"/>
+  </w:num>
+  <w:num w:numId="2" w16cid:durableId="475075336">
+    <w:abstractNumId w:val="1"/>
+  </w:num>
+  <w:num w:numId="3" w16cid:durableId="2009936999">
+    <w:abstractNumId w:val="2"/>
+  </w:num>
+  <w:num w:numId="4" w16cid:durableId="911887586">
+    <w:abstractNumId w:val="3"/>
+  </w:num>
+</w:numbering>
 </file>
 
 <file path=word/styles.xml><?xml version="1.0" encoding="utf-8"?>
@@ -627,7 +3402,7 @@
     <w:link w:val="Heading1Char"/>
     <w:uiPriority w:val="9"/>
     <w:qFormat/>
-    <w:rsid w:val="00A374A0"/>
+    <w:rsid w:val="007D3E8B"/>
     <w:pPr>
       <w:keepNext/>
       <w:keepLines/>
@@ -635,7 +3410,7 @@
       <w:outlineLvl w:val="0"/>
     </w:pPr>
     <w:rPr>
-      <w:rFonts w:ascii="Arial Black" w:eastAsiaTheme="majorEastAsia" w:hAnsi="Arial Black" w:cstheme="majorBidi"/>
+      <w:rFonts w:ascii="Times New Roman" w:eastAsiaTheme="majorEastAsia" w:hAnsi="Times New Roman" w:cstheme="majorBidi"/>
       <w:b/>
       <w:color w:val="4C94D8" w:themeColor="text2" w:themeTint="80"/>
       <w:sz w:val="40"/>
@@ -652,7 +3427,7 @@
     <w:uiPriority w:val="9"/>
     <w:unhideWhenUsed/>
     <w:qFormat/>
-    <w:rsid w:val="00A374A0"/>
+    <w:rsid w:val="007D3E8B"/>
     <w:pPr>
       <w:keepNext/>
       <w:keepLines/>
@@ -660,7 +3435,7 @@
       <w:outlineLvl w:val="1"/>
     </w:pPr>
     <w:rPr>
-      <w:rFonts w:ascii="Aharoni" w:eastAsiaTheme="majorEastAsia" w:hAnsi="Aharoni" w:cstheme="majorBidi"/>
+      <w:rFonts w:ascii="Times New Roman" w:eastAsiaTheme="majorEastAsia" w:hAnsi="Times New Roman" w:cstheme="majorBidi"/>
       <w:color w:val="00B0F0"/>
       <w:sz w:val="32"/>
       <w:szCs w:val="32"/>
@@ -832,7 +3607,6 @@
   <w:style w:type="character" w:default="1" w:styleId="DefaultParagraphFont">
     <w:name w:val="Default Paragraph Font"/>
     <w:uiPriority w:val="1"/>
-    <w:semiHidden/>
     <w:unhideWhenUsed/>
   </w:style>
   <w:style w:type="table" w:default="1" w:styleId="TableNormal">
@@ -861,9 +3635,9 @@
     <w:basedOn w:val="DefaultParagraphFont"/>
     <w:link w:val="Heading1"/>
     <w:uiPriority w:val="9"/>
-    <w:rsid w:val="00A374A0"/>
+    <w:rsid w:val="007D3E8B"/>
     <w:rPr>
-      <w:rFonts w:ascii="Arial Black" w:eastAsiaTheme="majorEastAsia" w:hAnsi="Arial Black" w:cstheme="majorBidi"/>
+      <w:rFonts w:ascii="Times New Roman" w:eastAsiaTheme="majorEastAsia" w:hAnsi="Times New Roman" w:cstheme="majorBidi"/>
       <w:b/>
       <w:color w:val="4C94D8" w:themeColor="text2" w:themeTint="80"/>
       <w:sz w:val="40"/>
@@ -876,9 +3650,9 @@
     <w:basedOn w:val="DefaultParagraphFont"/>
     <w:link w:val="Heading2"/>
     <w:uiPriority w:val="9"/>
-    <w:rsid w:val="00A374A0"/>
+    <w:rsid w:val="007D3E8B"/>
     <w:rPr>
-      <w:rFonts w:ascii="Aharoni" w:eastAsiaTheme="majorEastAsia" w:hAnsi="Aharoni" w:cstheme="majorBidi"/>
+      <w:rFonts w:ascii="Times New Roman" w:eastAsiaTheme="majorEastAsia" w:hAnsi="Times New Roman" w:cstheme="majorBidi"/>
       <w:color w:val="00B0F0"/>
       <w:sz w:val="32"/>
       <w:szCs w:val="32"/>
@@ -1172,6 +3946,60 @@
         <w:insideV w:val="single" w:sz="4" w:space="0" w:color="auto"/>
       </w:tblBorders>
     </w:tblPr>
+  </w:style>
+  <w:style w:type="character" w:styleId="Hyperlink">
+    <w:name w:val="Hyperlink"/>
+    <w:basedOn w:val="DefaultParagraphFont"/>
+    <w:uiPriority w:val="99"/>
+    <w:unhideWhenUsed/>
+    <w:rsid w:val="00072193"/>
+    <w:rPr>
+      <w:color w:val="467886" w:themeColor="hyperlink"/>
+      <w:u w:val="single"/>
+    </w:rPr>
+  </w:style>
+  <w:style w:type="character" w:styleId="UnresolvedMention">
+    <w:name w:val="Unresolved Mention"/>
+    <w:basedOn w:val="DefaultParagraphFont"/>
+    <w:uiPriority w:val="99"/>
+    <w:semiHidden/>
+    <w:unhideWhenUsed/>
+    <w:rsid w:val="00072193"/>
+    <w:rPr>
+      <w:color w:val="605E5C"/>
+      <w:shd w:val="clear" w:color="auto" w:fill="E1DFDD"/>
+    </w:rPr>
+  </w:style>
+  <w:style w:type="character" w:styleId="FollowedHyperlink">
+    <w:name w:val="FollowedHyperlink"/>
+    <w:basedOn w:val="DefaultParagraphFont"/>
+    <w:uiPriority w:val="99"/>
+    <w:semiHidden/>
+    <w:unhideWhenUsed/>
+    <w:rsid w:val="0000639F"/>
+    <w:rPr>
+      <w:color w:val="96607D" w:themeColor="followedHyperlink"/>
+      <w:u w:val="single"/>
+    </w:rPr>
+  </w:style>
+  <w:style w:type="paragraph" w:styleId="Caption">
+    <w:name w:val="caption"/>
+    <w:basedOn w:val="Normal"/>
+    <w:next w:val="Normal"/>
+    <w:uiPriority w:val="35"/>
+    <w:unhideWhenUsed/>
+    <w:qFormat/>
+    <w:rsid w:val="001E46A9"/>
+    <w:pPr>
+      <w:spacing w:after="200" w:line="240" w:lineRule="auto"/>
+    </w:pPr>
+    <w:rPr>
+      <w:i/>
+      <w:iCs/>
+      <w:color w:val="0E2841" w:themeColor="text2"/>
+      <w:sz w:val="18"/>
+      <w:szCs w:val="18"/>
+    </w:rPr>
   </w:style>
 </w:styles>
 </file>

</xml_diff>